<commit_message>
docs(Presentacion, informe) y feat(etl): actualizacion de Presentacion e informe con parte de proceso ETL, agreado como proceso final de ETL validacion automatica con script sql
</commit_message>
<xml_diff>
--- a/docs/informe/Informe_KentFoods_Fase1.docx
+++ b/docs/informe/Informe_KentFoods_Fase1.docx
@@ -1,6 +1,6 @@
 
 <file path=word/document.xml><?xml version="1.0" encoding="utf-8"?>
-<w:document xmlns:wpc="http://schemas.microsoft.com/office/word/2010/wordprocessingCanvas" xmlns:cx="http://schemas.microsoft.com/office/drawing/2014/chartex" xmlns:cx1="http://schemas.microsoft.com/office/drawing/2015/9/8/chartex" xmlns:cx2="http://schemas.microsoft.com/office/drawing/2015/10/21/chartex" xmlns:cx3="http://schemas.microsoft.com/office/drawing/2016/5/9/chartex" xmlns:cx4="http://schemas.microsoft.com/office/drawing/2016/5/10/chartex" xmlns:cx5="http://schemas.microsoft.com/office/drawing/2016/5/11/chartex" xmlns:cx6="http://schemas.microsoft.com/office/drawing/2016/5/12/chartex" xmlns:cx7="http://schemas.microsoft.com/office/drawing/2016/5/13/chartex" xmlns:cx8="http://schemas.microsoft.com/office/drawing/2016/5/14/chartex" xmlns:mc="http://schemas.openxmlformats.org/markup-compatibility/2006" xmlns:aink="http://schemas.microsoft.com/office/drawing/2016/ink" xmlns:am3d="http://schemas.microsoft.com/office/drawing/2017/model3d" xmlns:o="urn:schemas-microsoft-com:office:office" xmlns:oel="http://schemas.microsoft.com/office/2019/extlst" xmlns:r="http://schemas.openxmlformats.org/officeDocument/2006/relationships" xmlns:m="http://schemas.openxmlformats.org/officeDocument/2006/math" xmlns:v="urn:schemas-microsoft-com:vml" xmlns:wp14="http://schemas.microsoft.com/office/word/2010/wordprocessingDrawing" xmlns:wp="http://schemas.openxmlformats.org/drawingml/2006/wordprocessingDrawing" xmlns:w10="urn:schemas-microsoft-com:office:word" xmlns:w="http://schemas.openxmlformats.org/wordprocessingml/2006/main" xmlns:w14="http://schemas.microsoft.com/office/word/2010/wordml" xmlns:w15="http://schemas.microsoft.com/office/word/2012/wordml" xmlns:w16cex="http://schemas.microsoft.com/office/word/2018/wordml/cex" xmlns:w16cid="http://schemas.microsoft.com/office/word/2016/wordml/cid" xmlns:w16="http://schemas.microsoft.com/office/word/2018/wordml" xmlns:w16sdtdh="http://schemas.microsoft.com/office/word/2020/wordml/sdtdatahash" xmlns:w16se="http://schemas.microsoft.com/office/word/2015/wordml/symex" xmlns:wpg="http://schemas.microsoft.com/office/word/2010/wordprocessingGroup" xmlns:wpi="http://schemas.microsoft.com/office/word/2010/wordprocessingInk" xmlns:wne="http://schemas.microsoft.com/office/word/2006/wordml" xmlns:wps="http://schemas.microsoft.com/office/word/2010/wordprocessingShape" mc:Ignorable="w14 w15 w16se w16cid w16 w16cex w16sdtdh wp14">
+<w:document xmlns:wpc="http://schemas.microsoft.com/office/word/2010/wordprocessingCanvas" xmlns:cx="http://schemas.microsoft.com/office/drawing/2014/chartex" xmlns:cx1="http://schemas.microsoft.com/office/drawing/2015/9/8/chartex" xmlns:cx2="http://schemas.microsoft.com/office/drawing/2015/10/21/chartex" xmlns:cx3="http://schemas.microsoft.com/office/drawing/2016/5/9/chartex" xmlns:cx4="http://schemas.microsoft.com/office/drawing/2016/5/10/chartex" xmlns:cx5="http://schemas.microsoft.com/office/drawing/2016/5/11/chartex" xmlns:cx6="http://schemas.microsoft.com/office/drawing/2016/5/12/chartex" xmlns:cx7="http://schemas.microsoft.com/office/drawing/2016/5/13/chartex" xmlns:cx8="http://schemas.microsoft.com/office/drawing/2016/5/14/chartex" xmlns:mc="http://schemas.openxmlformats.org/markup-compatibility/2006" xmlns:aink="http://schemas.microsoft.com/office/drawing/2016/ink" xmlns:am3d="http://schemas.microsoft.com/office/drawing/2017/model3d" xmlns:o="urn:schemas-microsoft-com:office:office" xmlns:r="http://schemas.openxmlformats.org/officeDocument/2006/relationships" xmlns:m="http://schemas.openxmlformats.org/officeDocument/2006/math" xmlns:v="urn:schemas-microsoft-com:vml" xmlns:wp14="http://schemas.microsoft.com/office/word/2010/wordprocessingDrawing" xmlns:wp="http://schemas.openxmlformats.org/drawingml/2006/wordprocessingDrawing" xmlns:w10="urn:schemas-microsoft-com:office:word" xmlns:w="http://schemas.openxmlformats.org/wordprocessingml/2006/main" xmlns:w14="http://schemas.microsoft.com/office/word/2010/wordml" xmlns:w15="http://schemas.microsoft.com/office/word/2012/wordml" xmlns:w16cex="http://schemas.microsoft.com/office/word/2018/wordml/cex" xmlns:w16cid="http://schemas.microsoft.com/office/word/2016/wordml/cid" xmlns:w16="http://schemas.microsoft.com/office/word/2018/wordml" xmlns:w16sdtdh="http://schemas.microsoft.com/office/word/2020/wordml/sdtdatahash" xmlns:w16se="http://schemas.microsoft.com/office/word/2015/wordml/symex" xmlns:wpg="http://schemas.microsoft.com/office/word/2010/wordprocessingGroup" xmlns:wpi="http://schemas.microsoft.com/office/word/2010/wordprocessingInk" xmlns:wne="http://schemas.microsoft.com/office/word/2006/wordml" xmlns:wps="http://schemas.microsoft.com/office/word/2010/wordprocessingShape" mc:Ignorable="w14 w15 w16se w16cid w16 w16cex w16sdtdh wp14">
   <w:body>
     <w:p/>
     <w:p/>
@@ -115,6 +115,7 @@
         <w:alias w:val="Índice"/>
         <w:id w:val="-1868367810"/>
       </w:sdtPr>
+      <w:sdtEndPr/>
       <w:sdtContent>
         <w:p>
           <w:r>
@@ -141,7 +142,7 @@
     </w:p>
     <w:p>
       <w:pPr>
-        <w:pStyle w:val="Heading1"/>
+        <w:pStyle w:val="Ttulo1"/>
       </w:pPr>
       <w:r>
         <w:lastRenderedPageBreak/>
@@ -161,7 +162,10 @@
       </w:r>
       <w:proofErr w:type="spellEnd"/>
       <w:r>
-        <w:t xml:space="preserve"> es una empresa que vende alimentos a través de envío y que ha crecido rápidamente durante los últimos años. Debido a este crecimiento, su propietario ha decidido incorporar Inteligencia de Negocios a la compañía, con el fin de que los encargados cuenten con información confiable para tomar decisiones.</w:t>
+        <w:t xml:space="preserve"> es una empresa que vende alimentos a través de envío y que ha crecido rápidamente durante los últimos años. Debido a este crecimiento, su prop</w:t>
+      </w:r>
+      <w:r>
+        <w:t>ietario ha decidido incorporar Inteligencia de Negocios a la compañía, con el fin de que los encargados cuenten con información confiable para tomar decisiones.</w:t>
       </w:r>
     </w:p>
     <w:p>
@@ -169,7 +173,13 @@
         <w:jc w:val="both"/>
       </w:pPr>
       <w:r>
-        <w:t>El presente informe documenta la primera parte de la propuesta de solución desarrollada por el equipo. En ella se analiza la base de datos transaccional de la empresa, se definen los indicadores de desempeño (KPI) que apoyarán la toma de decisiones y se diseña un modelo dimensional aplicando los cuatro pasos de la metodología de Kimball. Finalmente, se describe la implementación de dicho modelo en el gestor de base de datos SQL Server.</w:t>
+        <w:t xml:space="preserve">El presente informe documenta la primera parte de la propuesta de solución desarrollada por el </w:t>
+      </w:r>
+      <w:r>
+        <w:t>equipo. En ella se analiza la base de datos transaccional de la empresa, se definen los indicadores de desempeño (KPI) que apoyarán la toma de decisiones y se diseña un modelo dimensional aplicando los cuatro pasos de la metodología de Kimball. Finalmente,</w:t>
+      </w:r>
+      <w:r>
+        <w:t xml:space="preserve"> se describe la implementación de dicho modelo en el gestor de base de datos SQL Server.</w:t>
       </w:r>
     </w:p>
     <w:p>
@@ -198,7 +208,7 @@
     </w:p>
     <w:p>
       <w:pPr>
-        <w:pStyle w:val="Heading1"/>
+        <w:pStyle w:val="Ttulo1"/>
       </w:pPr>
       <w:r>
         <w:t>Desarrollo</w:t>
@@ -206,7 +216,7 @@
     </w:p>
     <w:p>
       <w:pPr>
-        <w:pStyle w:val="Heading2"/>
+        <w:pStyle w:val="Ttulo2"/>
       </w:pPr>
       <w:r>
         <w:t>1. Contexto y problema de negocio</w:t>
@@ -217,7 +227,10 @@
         <w:jc w:val="both"/>
       </w:pPr>
       <w:r>
-        <w:t xml:space="preserve">La base de datos transaccional de Kent </w:t>
+        <w:t>La base d</w:t>
+      </w:r>
+      <w:r>
+        <w:t xml:space="preserve">e datos transaccional de Kent </w:t>
       </w:r>
       <w:proofErr w:type="spellStart"/>
       <w:r>
@@ -225,7 +238,10 @@
       </w:r>
       <w:proofErr w:type="spellEnd"/>
       <w:r>
-        <w:t xml:space="preserve"> registra las órdenes realizadas por los clientes, el detalle de los productos de cada orden, los productos y sus proveedores, las categorías, los empleados con sus territorios y regiones, y los transportistas que realizan los envíos.</w:t>
+        <w:t xml:space="preserve"> registra las órdenes realizadas por los clientes, el detalle de los productos de cada orden, los productos y sus proveedores, las categorías, los empleados con sus territorios y regiones, y los transportistas que realiza</w:t>
+      </w:r>
+      <w:r>
+        <w:t>n los envíos.</w:t>
       </w:r>
     </w:p>
     <w:p>
@@ -233,12 +249,15 @@
         <w:jc w:val="both"/>
       </w:pPr>
       <w:r>
-        <w:t>Esta base está diseñada para operar el negocio y no para analizarlo. Responder preguntas como cuánto se vendió por categoría en un trimestre, qué vendedor genera más ingresos o cuánto demoran los despachos exige unir varias tablas y calcular montos que no se encuentran almacenados. Por ello, la empresa no dispone hoy de una visión consolidada de su desempeño comercial y logístico.</w:t>
-      </w:r>
-    </w:p>
-    <w:p>
-      <w:pPr>
-        <w:pStyle w:val="Heading2"/>
+        <w:t xml:space="preserve">Esta base está diseñada para operar el negocio y no para analizarlo. Responder preguntas como cuánto se vendió por categoría en un trimestre, qué vendedor genera más ingresos o cuánto demoran los despachos exige unir varias tablas y calcular </w:t>
+      </w:r>
+      <w:r>
+        <w:t>montos que no se encuentran almacenados. Por ello, la empresa no dispone hoy de una visión consolidada de su desempeño comercial y logístico.</w:t>
+      </w:r>
+    </w:p>
+    <w:p>
+      <w:pPr>
+        <w:pStyle w:val="Ttulo2"/>
       </w:pPr>
       <w:r>
         <w:t>2. Análisis de la base de datos transaccional</w:t>
@@ -249,7 +268,10 @@
         <w:jc w:val="both"/>
       </w:pPr>
       <w:r>
-        <w:t xml:space="preserve">Antes de diseñar el modelo dimensional se analizaron los datos de la base </w:t>
+        <w:t>Antes de diseñar el modelo dimensional se analizaron los datos de la</w:t>
+      </w:r>
+      <w:r>
+        <w:t xml:space="preserve"> base </w:t>
       </w:r>
       <w:proofErr w:type="spellStart"/>
       <w:r>
@@ -292,12 +314,6 @@
         <w:gridCol w:w="3780"/>
       </w:tblGrid>
       <w:tr>
-        <w:tblPrEx>
-          <w:tblCellMar>
-            <w:top w:w="0" w:type="dxa"/>
-            <w:bottom w:w="0" w:type="dxa"/>
-          </w:tblCellMar>
-        </w:tblPrEx>
         <w:tc>
           <w:tcPr>
             <w:tcW w:w="1800" w:type="dxa"/>
@@ -387,12 +403,6 @@
         </w:tc>
       </w:tr>
       <w:tr>
-        <w:tblPrEx>
-          <w:tblCellMar>
-            <w:top w:w="0" w:type="dxa"/>
-            <w:bottom w:w="0" w:type="dxa"/>
-          </w:tblCellMar>
-        </w:tblPrEx>
         <w:tc>
           <w:tcPr>
             <w:tcW w:w="1800" w:type="dxa"/>
@@ -448,7 +458,14 @@
                 <w:sz w:val="20"/>
                 <w:szCs w:val="20"/>
               </w:rPr>
-              <w:t>830 órdenes y 2.155 líneas de detalle, entre el 4 de julio de 2016 y el 6 de mayo de 2018.</w:t>
+              <w:t>830 órdenes y</w:t>
+            </w:r>
+            <w:r>
+              <w:rPr>
+                <w:sz w:val="20"/>
+                <w:szCs w:val="20"/>
+              </w:rPr>
+              <w:t xml:space="preserve"> 2.155 líneas de detalle, entre el 4 de julio de 2016 y el 6 de mayo de 2018.</w:t>
             </w:r>
           </w:p>
         </w:tc>
@@ -483,12 +500,6 @@
         </w:tc>
       </w:tr>
       <w:tr>
-        <w:tblPrEx>
-          <w:tblCellMar>
-            <w:top w:w="0" w:type="dxa"/>
-            <w:bottom w:w="0" w:type="dxa"/>
-          </w:tblCellMar>
-        </w:tblPrEx>
         <w:tc>
           <w:tcPr>
             <w:tcW w:w="1800" w:type="dxa"/>
@@ -514,7 +525,14 @@
                 <w:sz w:val="20"/>
                 <w:szCs w:val="20"/>
               </w:rPr>
-              <w:t>Órdenes sin envío</w:t>
+              <w:t xml:space="preserve">Órdenes sin </w:t>
+            </w:r>
+            <w:r>
+              <w:rPr>
+                <w:sz w:val="20"/>
+                <w:szCs w:val="20"/>
+              </w:rPr>
+              <w:t>envío</w:t>
             </w:r>
           </w:p>
         </w:tc>
@@ -578,12 +596,6 @@
         </w:tc>
       </w:tr>
       <w:tr>
-        <w:tblPrEx>
-          <w:tblCellMar>
-            <w:top w:w="0" w:type="dxa"/>
-            <w:bottom w:w="0" w:type="dxa"/>
-          </w:tblCellMar>
-        </w:tblPrEx>
         <w:tc>
           <w:tcPr>
             <w:tcW w:w="1800" w:type="dxa"/>
@@ -638,7 +650,14 @@
                 <w:sz w:val="20"/>
                 <w:szCs w:val="20"/>
               </w:rPr>
-              <w:t>658 líneas de detalle tienen un precio unitario distinto al precio de lista actual del producto.</w:t>
+              <w:t>658 líneas de detalle tienen un precio unitario distinto al precio de lista act</w:t>
+            </w:r>
+            <w:r>
+              <w:rPr>
+                <w:sz w:val="20"/>
+                <w:szCs w:val="20"/>
+              </w:rPr>
+              <w:t>ual del producto.</w:t>
             </w:r>
           </w:p>
         </w:tc>
@@ -673,12 +692,6 @@
         </w:tc>
       </w:tr>
       <w:tr>
-        <w:tblPrEx>
-          <w:tblCellMar>
-            <w:top w:w="0" w:type="dxa"/>
-            <w:bottom w:w="0" w:type="dxa"/>
-          </w:tblCellMar>
-        </w:tblPrEx>
         <w:tc>
           <w:tcPr>
             <w:tcW w:w="1800" w:type="dxa"/>
@@ -762,18 +775,19 @@
                 <w:sz w:val="20"/>
                 <w:szCs w:val="20"/>
               </w:rPr>
-              <w:t>Se convierten a un tipo decimal exacto.</w:t>
+              <w:t xml:space="preserve">Se convierten a un tipo decimal </w:t>
+            </w:r>
+            <w:r>
+              <w:rPr>
+                <w:sz w:val="20"/>
+                <w:szCs w:val="20"/>
+              </w:rPr>
+              <w:t>exacto.</w:t>
             </w:r>
           </w:p>
         </w:tc>
       </w:tr>
       <w:tr>
-        <w:tblPrEx>
-          <w:tblCellMar>
-            <w:top w:w="0" w:type="dxa"/>
-            <w:bottom w:w="0" w:type="dxa"/>
-          </w:tblCellMar>
-        </w:tblPrEx>
         <w:tc>
           <w:tcPr>
             <w:tcW w:w="1800" w:type="dxa"/>
@@ -863,12 +877,6 @@
         </w:tc>
       </w:tr>
       <w:tr>
-        <w:tblPrEx>
-          <w:tblCellMar>
-            <w:top w:w="0" w:type="dxa"/>
-            <w:bottom w:w="0" w:type="dxa"/>
-          </w:tblCellMar>
-        </w:tblPrEx>
         <w:tc>
           <w:tcPr>
             <w:tcW w:w="1800" w:type="dxa"/>
@@ -958,12 +966,6 @@
         </w:tc>
       </w:tr>
       <w:tr>
-        <w:tblPrEx>
-          <w:tblCellMar>
-            <w:top w:w="0" w:type="dxa"/>
-            <w:bottom w:w="0" w:type="dxa"/>
-          </w:tblCellMar>
-        </w:tblPrEx>
         <w:tc>
           <w:tcPr>
             <w:tcW w:w="1800" w:type="dxa"/>
@@ -1018,7 +1020,14 @@
                 <w:sz w:val="20"/>
                 <w:szCs w:val="20"/>
               </w:rPr>
-              <w:t>2 de los 91 clientes no registran órdenes.</w:t>
+              <w:t xml:space="preserve">2 de los 91 clientes no </w:t>
+            </w:r>
+            <w:r>
+              <w:rPr>
+                <w:sz w:val="20"/>
+                <w:szCs w:val="20"/>
+              </w:rPr>
+              <w:t>registran órdenes.</w:t>
             </w:r>
           </w:p>
         </w:tc>
@@ -1053,12 +1062,6 @@
         </w:tc>
       </w:tr>
       <w:tr>
-        <w:tblPrEx>
-          <w:tblCellMar>
-            <w:top w:w="0" w:type="dxa"/>
-            <w:bottom w:w="0" w:type="dxa"/>
-          </w:tblCellMar>
-        </w:tblPrEx>
         <w:tc>
           <w:tcPr>
             <w:tcW w:w="1800" w:type="dxa"/>
@@ -1148,12 +1151,6 @@
         </w:tc>
       </w:tr>
       <w:tr>
-        <w:tblPrEx>
-          <w:tblCellMar>
-            <w:top w:w="0" w:type="dxa"/>
-            <w:bottom w:w="0" w:type="dxa"/>
-          </w:tblCellMar>
-        </w:tblPrEx>
         <w:tc>
           <w:tcPr>
             <w:tcW w:w="1800" w:type="dxa"/>
@@ -1208,7 +1205,14 @@
                 <w:sz w:val="20"/>
                 <w:szCs w:val="20"/>
               </w:rPr>
-              <w:t>La base no registra costo de productos ni costo de flete.</w:t>
+              <w:t xml:space="preserve">La base no registra costo </w:t>
+            </w:r>
+            <w:r>
+              <w:rPr>
+                <w:sz w:val="20"/>
+                <w:szCs w:val="20"/>
+              </w:rPr>
+              <w:t>de productos ni costo de flete.</w:t>
             </w:r>
           </w:p>
         </w:tc>
@@ -1245,7 +1249,7 @@
     </w:tbl>
     <w:p>
       <w:pPr>
-        <w:pStyle w:val="Heading2"/>
+        <w:pStyle w:val="Ttulo2"/>
       </w:pPr>
       <w:r>
         <w:t>3. Indicadores de desempeño (KPI)</w:t>
@@ -1256,7 +1260,10 @@
         <w:jc w:val="both"/>
       </w:pPr>
       <w:r>
-        <w:t xml:space="preserve">A partir del análisis del caso y de los datos disponibles se definieron seis indicadores. Los cuatro primeros miden el resultado comercial de la empresa y los dos últimos miden la operación de envío, que constituye el núcleo del modelo de negocio de Kent </w:t>
+        <w:t>A partir del análisis del caso y de los datos disponibles se definieron seis indicadores</w:t>
+      </w:r>
+      <w:r>
+        <w:t xml:space="preserve">. Los cuatro primeros miden el resultado comercial de la empresa y los dos últimos miden la operación de envío, que constituye el núcleo del modelo de negocio de Kent </w:t>
       </w:r>
       <w:proofErr w:type="spellStart"/>
       <w:r>
@@ -1264,7 +1271,10 @@
       </w:r>
       <w:proofErr w:type="spellEnd"/>
       <w:r>
-        <w:t>. La Tabla 2 presenta cada KPI con su fórmula, la decisión que apoya y su valor calculado sobre los datos actuales.</w:t>
+        <w:t>. La Tabla 2 presenta cada KPI con su fórmula, la decisión que apoya y su valor calc</w:t>
+      </w:r>
+      <w:r>
+        <w:t>ulado sobre los datos actuales.</w:t>
       </w:r>
     </w:p>
     <w:p>
@@ -1300,12 +1310,6 @@
         <w:gridCol w:w="2000"/>
       </w:tblGrid>
       <w:tr>
-        <w:tblPrEx>
-          <w:tblCellMar>
-            <w:top w:w="0" w:type="dxa"/>
-            <w:bottom w:w="0" w:type="dxa"/>
-          </w:tblCellMar>
-        </w:tblPrEx>
         <w:tc>
           <w:tcPr>
             <w:tcW w:w="1900" w:type="dxa"/>
@@ -1424,12 +1428,6 @@
         </w:tc>
       </w:tr>
       <w:tr>
-        <w:tblPrEx>
-          <w:tblCellMar>
-            <w:top w:w="0" w:type="dxa"/>
-            <w:bottom w:w="0" w:type="dxa"/>
-          </w:tblCellMar>
-        </w:tblPrEx>
         <w:tc>
           <w:tcPr>
             <w:tcW w:w="1900" w:type="dxa"/>
@@ -1551,18 +1549,19 @@
                 <w:sz w:val="20"/>
                 <w:szCs w:val="20"/>
               </w:rPr>
-              <w:t>1.265.792,76 en total. Enero a abril de 2018 frente a enero a abril de 2017: +120,7 %.</w:t>
+              <w:t>1.265.792,76 en total. Enero a abril de 2018 frente a enero a abril de</w:t>
+            </w:r>
+            <w:r>
+              <w:rPr>
+                <w:sz w:val="20"/>
+                <w:szCs w:val="20"/>
+              </w:rPr>
+              <w:t xml:space="preserve"> 2017: +120,7 %.</w:t>
             </w:r>
           </w:p>
         </w:tc>
       </w:tr>
       <w:tr>
-        <w:tblPrEx>
-          <w:tblCellMar>
-            <w:top w:w="0" w:type="dxa"/>
-            <w:bottom w:w="0" w:type="dxa"/>
-          </w:tblCellMar>
-        </w:tblPrEx>
         <w:tc>
           <w:tcPr>
             <w:tcW w:w="1900" w:type="dxa"/>
@@ -1681,12 +1680,6 @@
         </w:tc>
       </w:tr>
       <w:tr>
-        <w:tblPrEx>
-          <w:tblCellMar>
-            <w:top w:w="0" w:type="dxa"/>
-            <w:bottom w:w="0" w:type="dxa"/>
-          </w:tblCellMar>
-        </w:tblPrEx>
         <w:tc>
           <w:tcPr>
             <w:tcW w:w="1900" w:type="dxa"/>
@@ -1805,12 +1798,6 @@
         </w:tc>
       </w:tr>
       <w:tr>
-        <w:tblPrEx>
-          <w:tblCellMar>
-            <w:top w:w="0" w:type="dxa"/>
-            <w:bottom w:w="0" w:type="dxa"/>
-          </w:tblCellMar>
-        </w:tblPrEx>
         <w:tc>
           <w:tcPr>
             <w:tcW w:w="1900" w:type="dxa"/>
@@ -1923,18 +1910,19 @@
                 <w:sz w:val="20"/>
                 <w:szCs w:val="20"/>
               </w:rPr>
-              <w:t>Se analiza por empleado.</w:t>
+              <w:t>Se analiza por emplea</w:t>
+            </w:r>
+            <w:r>
+              <w:rPr>
+                <w:sz w:val="20"/>
+                <w:szCs w:val="20"/>
+              </w:rPr>
+              <w:t>do.</w:t>
             </w:r>
           </w:p>
         </w:tc>
       </w:tr>
       <w:tr>
-        <w:tblPrEx>
-          <w:tblCellMar>
-            <w:top w:w="0" w:type="dxa"/>
-            <w:bottom w:w="0" w:type="dxa"/>
-          </w:tblCellMar>
-        </w:tblPrEx>
         <w:tc>
           <w:tcPr>
             <w:tcW w:w="1900" w:type="dxa"/>
@@ -2053,12 +2041,6 @@
         </w:tc>
       </w:tr>
       <w:tr>
-        <w:tblPrEx>
-          <w:tblCellMar>
-            <w:top w:w="0" w:type="dxa"/>
-            <w:bottom w:w="0" w:type="dxa"/>
-          </w:tblCellMar>
-        </w:tblPrEx>
         <w:tc>
           <w:tcPr>
             <w:tcW w:w="1900" w:type="dxa"/>
@@ -2179,7 +2161,7 @@
     </w:tbl>
     <w:p>
       <w:pPr>
-        <w:pStyle w:val="Heading2"/>
+        <w:pStyle w:val="Ttulo2"/>
       </w:pPr>
       <w:r>
         <w:t>4. Modelo dimensional</w:t>
@@ -2190,12 +2172,15 @@
         <w:jc w:val="both"/>
       </w:pPr>
       <w:r>
-        <w:t>El modelo dimensional se diseñó aplicando los cuatro pasos de la metodología de Kimball, que se detallan a continuación.</w:t>
-      </w:r>
-    </w:p>
-    <w:p>
-      <w:pPr>
-        <w:pStyle w:val="Heading2"/>
+        <w:t>El modelo dimensional se diseñó aplicando los cuatro pasos de la metodología de Kimball, que se d</w:t>
+      </w:r>
+      <w:r>
+        <w:t>etallan a continuación.</w:t>
+      </w:r>
+    </w:p>
+    <w:p>
+      <w:pPr>
+        <w:pStyle w:val="Ttulo2"/>
       </w:pPr>
       <w:r>
         <w:t>4.1 Paso 1: Elegir el proceso de negocio</w:t>
@@ -2206,12 +2191,15 @@
         <w:jc w:val="both"/>
       </w:pPr>
       <w:r>
-        <w:t>El proceso de negocio elegido es Ventas, entendido como la toma y el despacho de las órdenes de los clientes. Es el proceso que genera los ingresos de la empresa y el único de la base transaccional que contiene hechos medibles: cantidades, precios, descuentos y fechas. Como todos los KPI definidos se calculan sobre este proceso, basta con una sola tabla de hechos.</w:t>
-      </w:r>
-    </w:p>
-    <w:p>
-      <w:pPr>
-        <w:pStyle w:val="Heading2"/>
+        <w:t>El proceso de negocio elegido es Ventas, entendido como la toma y el despacho de las órdenes de los clientes. Es el proceso que genera los ingresos de la empresa y el único de la base transac</w:t>
+      </w:r>
+      <w:r>
+        <w:t>cional que contiene hechos medibles: cantidades, precios, descuentos y fechas. Como todos los KPI definidos se calculan sobre este proceso, basta con una sola tabla de hechos.</w:t>
+      </w:r>
+    </w:p>
+    <w:p>
+      <w:pPr>
+        <w:pStyle w:val="Ttulo2"/>
       </w:pPr>
       <w:r>
         <w:t>4.2 Paso 2: Establecer el nivel de granularidad</w:t>
@@ -2222,7 +2210,10 @@
         <w:jc w:val="both"/>
       </w:pPr>
       <w:r>
-        <w:t xml:space="preserve">La granularidad definida es una fila por cada producto vendido dentro de una orden, lo que equivale a una fila de la tabla </w:t>
+        <w:t xml:space="preserve">La granularidad definida es una </w:t>
+      </w:r>
+      <w:r>
+        <w:t xml:space="preserve">fila por cada producto vendido dentro de una orden, lo que equivale a una fila de la tabla </w:t>
       </w:r>
       <w:proofErr w:type="spellStart"/>
       <w:r>
@@ -2235,7 +2226,7 @@
     </w:p>
     <w:p>
       <w:pPr>
-        <w:pStyle w:val="ListParagraph"/>
+        <w:pStyle w:val="Prrafodelista"/>
         <w:numPr>
           <w:ilvl w:val="0"/>
           <w:numId w:val="2"/>
@@ -2243,12 +2234,15 @@
         <w:jc w:val="both"/>
       </w:pPr>
       <w:r>
-        <w:t>Es el nivel más detallado disponible. Si se eligiera la orden como grano, se perdería la posibilidad de analizar por producto y categoría.</w:t>
-      </w:r>
-    </w:p>
-    <w:p>
-      <w:pPr>
-        <w:pStyle w:val="ListParagraph"/>
+        <w:t>Es el nivel más detallado disponible. Si se eligiera la orden como grano, se perdería la posibilidad d</w:t>
+      </w:r>
+      <w:r>
+        <w:t>e analizar por producto y categoría.</w:t>
+      </w:r>
+    </w:p>
+    <w:p>
+      <w:pPr>
+        <w:pStyle w:val="Prrafodelista"/>
         <w:numPr>
           <w:ilvl w:val="0"/>
           <w:numId w:val="2"/>
@@ -2261,7 +2255,7 @@
     </w:p>
     <w:p>
       <w:pPr>
-        <w:pStyle w:val="ListParagraph"/>
+        <w:pStyle w:val="Prrafodelista"/>
         <w:numPr>
           <w:ilvl w:val="0"/>
           <w:numId w:val="2"/>
@@ -2270,12 +2264,15 @@
       </w:pPr>
       <w:r>
         <w:lastRenderedPageBreak/>
-        <w:t>Coincide uno a uno con la tabla de origen, lo que simplifica el proceso ETL y la validación de la carga.</w:t>
-      </w:r>
-    </w:p>
-    <w:p>
-      <w:pPr>
-        <w:pStyle w:val="Heading2"/>
+        <w:t xml:space="preserve">Coincide uno a uno con la tabla de origen, lo que simplifica el proceso ETL y la </w:t>
+      </w:r>
+      <w:r>
+        <w:t>validación de la carga.</w:t>
+      </w:r>
+    </w:p>
+    <w:p>
+      <w:pPr>
+        <w:pStyle w:val="Ttulo2"/>
       </w:pPr>
       <w:r>
         <w:t>4.3 Paso 3: Elegir las dimensiones</w:t>
@@ -2321,12 +2318,6 @@
         <w:gridCol w:w="4960"/>
       </w:tblGrid>
       <w:tr>
-        <w:tblPrEx>
-          <w:tblCellMar>
-            <w:top w:w="0" w:type="dxa"/>
-            <w:bottom w:w="0" w:type="dxa"/>
-          </w:tblCellMar>
-        </w:tblPrEx>
         <w:tc>
           <w:tcPr>
             <w:tcW w:w="2000" w:type="dxa"/>
@@ -2416,12 +2407,6 @@
         </w:tc>
       </w:tr>
       <w:tr>
-        <w:tblPrEx>
-          <w:tblCellMar>
-            <w:top w:w="0" w:type="dxa"/>
-            <w:bottom w:w="0" w:type="dxa"/>
-          </w:tblCellMar>
-        </w:tblPrEx>
         <w:tc>
           <w:tcPr>
             <w:tcW w:w="2000" w:type="dxa"/>
@@ -2513,12 +2498,6 @@
         </w:tc>
       </w:tr>
       <w:tr>
-        <w:tblPrEx>
-          <w:tblCellMar>
-            <w:top w:w="0" w:type="dxa"/>
-            <w:bottom w:w="0" w:type="dxa"/>
-          </w:tblCellMar>
-        </w:tblPrEx>
         <w:tc>
           <w:tcPr>
             <w:tcW w:w="2000" w:type="dxa"/>
@@ -2610,12 +2589,6 @@
         </w:tc>
       </w:tr>
       <w:tr>
-        <w:tblPrEx>
-          <w:tblCellMar>
-            <w:top w:w="0" w:type="dxa"/>
-            <w:bottom w:w="0" w:type="dxa"/>
-          </w:tblCellMar>
-        </w:tblPrEx>
         <w:tc>
           <w:tcPr>
             <w:tcW w:w="2000" w:type="dxa"/>
@@ -2723,12 +2696,6 @@
         </w:tc>
       </w:tr>
       <w:tr>
-        <w:tblPrEx>
-          <w:tblCellMar>
-            <w:top w:w="0" w:type="dxa"/>
-            <w:bottom w:w="0" w:type="dxa"/>
-          </w:tblCellMar>
-        </w:tblPrEx>
         <w:tc>
           <w:tcPr>
             <w:tcW w:w="2000" w:type="dxa"/>
@@ -2820,12 +2787,6 @@
         </w:tc>
       </w:tr>
       <w:tr>
-        <w:tblPrEx>
-          <w:tblCellMar>
-            <w:top w:w="0" w:type="dxa"/>
-            <w:bottom w:w="0" w:type="dxa"/>
-          </w:tblCellMar>
-        </w:tblPrEx>
         <w:tc>
           <w:tcPr>
             <w:tcW w:w="2000" w:type="dxa"/>
@@ -2911,7 +2872,14 @@
                 <w:sz w:val="20"/>
                 <w:szCs w:val="20"/>
               </w:rPr>
-              <w:t>Código del transportista y nombre del transportista.</w:t>
+              <w:t>Código de</w:t>
+            </w:r>
+            <w:r>
+              <w:rPr>
+                <w:sz w:val="20"/>
+                <w:szCs w:val="20"/>
+              </w:rPr>
+              <w:t>l transportista y nombre del transportista.</w:t>
             </w:r>
           </w:p>
         </w:tc>
@@ -2922,12 +2890,15 @@
         <w:jc w:val="both"/>
       </w:pPr>
       <w:r>
-        <w:t>La dimensión tiempo cumple dos roles dentro del modelo: representa la fecha de la orden y la fecha de envío. Además, el número de orden se mantiene en la tabla de hechos como dimensión degenerada, ya que no posee atributos propios, pero es necesario para contar órdenes y calcular el ticket promedio.</w:t>
-      </w:r>
-    </w:p>
-    <w:p>
-      <w:pPr>
-        <w:pStyle w:val="Heading2"/>
+        <w:t>La dimensión tiempo cumple dos roles dentro del modelo: representa la fecha de la orden y la fecha de envío. Además, el número de orden se mantiene en la tabla de hechos como dimensión degenerada, ya que no pose</w:t>
+      </w:r>
+      <w:r>
+        <w:t>e atributos propios, pero es necesario para contar órdenes y calcular el ticket promedio.</w:t>
+      </w:r>
+    </w:p>
+    <w:p>
+      <w:pPr>
+        <w:pStyle w:val="Ttulo2"/>
       </w:pPr>
       <w:r>
         <w:t>4.4 Paso 4: Identificar las medidas y la tabla de hechos</w:t>
@@ -2946,7 +2917,10 @@
       </w:r>
       <w:proofErr w:type="spellEnd"/>
       <w:r>
-        <w:t xml:space="preserve"> y contiene las medidas presentadas en la Tabla 4. Los montos se calculan durante el proceso ETL, debido a que no existen en la base de origen y son la base de la mayoría de los KPI.</w:t>
+        <w:t xml:space="preserve"> y contiene las medidas presentadas en la Tabla 4. Los montos se cal</w:t>
+      </w:r>
+      <w:r>
+        <w:t>culan durante el proceso ETL, debido a que no existen en la base de origen y son la base de la mayoría de los KPI.</w:t>
       </w:r>
     </w:p>
     <w:p>
@@ -2981,12 +2955,6 @@
         <w:gridCol w:w="2000"/>
       </w:tblGrid>
       <w:tr>
-        <w:tblPrEx>
-          <w:tblCellMar>
-            <w:top w:w="0" w:type="dxa"/>
-            <w:bottom w:w="0" w:type="dxa"/>
-          </w:tblCellMar>
-        </w:tblPrEx>
         <w:tc>
           <w:tcPr>
             <w:tcW w:w="2200" w:type="dxa"/>
@@ -3076,12 +3044,6 @@
         </w:tc>
       </w:tr>
       <w:tr>
-        <w:tblPrEx>
-          <w:tblCellMar>
-            <w:top w:w="0" w:type="dxa"/>
-            <w:bottom w:w="0" w:type="dxa"/>
-          </w:tblCellMar>
-        </w:tblPrEx>
         <w:tc>
           <w:tcPr>
             <w:tcW w:w="2200" w:type="dxa"/>
@@ -3171,12 +3133,6 @@
         </w:tc>
       </w:tr>
       <w:tr>
-        <w:tblPrEx>
-          <w:tblCellMar>
-            <w:top w:w="0" w:type="dxa"/>
-            <w:bottom w:w="0" w:type="dxa"/>
-          </w:tblCellMar>
-        </w:tblPrEx>
         <w:tc>
           <w:tcPr>
             <w:tcW w:w="2200" w:type="dxa"/>
@@ -3233,7 +3189,14 @@
                 <w:sz w:val="20"/>
                 <w:szCs w:val="20"/>
               </w:rPr>
-              <w:t>Precio unitario del detalle de la orden.</w:t>
+              <w:t xml:space="preserve">Precio </w:t>
+            </w:r>
+            <w:r>
+              <w:rPr>
+                <w:sz w:val="20"/>
+                <w:szCs w:val="20"/>
+              </w:rPr>
+              <w:t>unitario del detalle de la orden.</w:t>
             </w:r>
           </w:p>
         </w:tc>
@@ -3268,12 +3231,6 @@
         </w:tc>
       </w:tr>
       <w:tr>
-        <w:tblPrEx>
-          <w:tblCellMar>
-            <w:top w:w="0" w:type="dxa"/>
-            <w:bottom w:w="0" w:type="dxa"/>
-          </w:tblCellMar>
-        </w:tblPrEx>
         <w:tc>
           <w:tcPr>
             <w:tcW w:w="2200" w:type="dxa"/>
@@ -3363,12 +3320,6 @@
         </w:tc>
       </w:tr>
       <w:tr>
-        <w:tblPrEx>
-          <w:tblCellMar>
-            <w:top w:w="0" w:type="dxa"/>
-            <w:bottom w:w="0" w:type="dxa"/>
-          </w:tblCellMar>
-        </w:tblPrEx>
         <w:tc>
           <w:tcPr>
             <w:tcW w:w="2200" w:type="dxa"/>
@@ -3460,12 +3411,6 @@
         </w:tc>
       </w:tr>
       <w:tr>
-        <w:tblPrEx>
-          <w:tblCellMar>
-            <w:top w:w="0" w:type="dxa"/>
-            <w:bottom w:w="0" w:type="dxa"/>
-          </w:tblCellMar>
-        </w:tblPrEx>
         <w:tc>
           <w:tcPr>
             <w:tcW w:w="2200" w:type="dxa"/>
@@ -3558,12 +3503,6 @@
         </w:tc>
       </w:tr>
       <w:tr>
-        <w:tblPrEx>
-          <w:tblCellMar>
-            <w:top w:w="0" w:type="dxa"/>
-            <w:bottom w:w="0" w:type="dxa"/>
-          </w:tblCellMar>
-        </w:tblPrEx>
         <w:tc>
           <w:tcPr>
             <w:tcW w:w="2200" w:type="dxa"/>
@@ -3620,7 +3559,14 @@
                 <w:sz w:val="20"/>
                 <w:szCs w:val="20"/>
               </w:rPr>
-              <w:t>Monto bruto − monto de descuento.</w:t>
+              <w:t xml:space="preserve">Monto bruto − monto de </w:t>
+            </w:r>
+            <w:r>
+              <w:rPr>
+                <w:sz w:val="20"/>
+                <w:szCs w:val="20"/>
+              </w:rPr>
+              <w:t>descuento.</w:t>
             </w:r>
           </w:p>
         </w:tc>
@@ -3655,12 +3601,6 @@
         </w:tc>
       </w:tr>
       <w:tr>
-        <w:tblPrEx>
-          <w:tblCellMar>
-            <w:top w:w="0" w:type="dxa"/>
-            <w:bottom w:w="0" w:type="dxa"/>
-          </w:tblCellMar>
-        </w:tblPrEx>
         <w:tc>
           <w:tcPr>
             <w:tcW w:w="2200" w:type="dxa"/>
@@ -3765,12 +3705,15 @@
       </w:r>
       <w:proofErr w:type="spellEnd"/>
       <w:r>
-        <w:t xml:space="preserve"> se repite en todas las líneas de una misma orden. Por ello, el KPI de tiempo promedio de despacho se calcula contando cada orden una sola vez (8,49 días); un promedio directo sobre las líneas entregaría 8,35 días, ya que pondera más a las órdenes con más productos.</w:t>
-      </w:r>
-    </w:p>
-    <w:p>
-      <w:pPr>
-        <w:pStyle w:val="Heading2"/>
+        <w:t xml:space="preserve"> se repite en todas las líneas de una misma orden. Por ello, el KPI de tiempo promedio de despacho se calcula contando cada orden una sola vez (8,49 días); un promedio directo sobre las líneas entregaría 8,35 días, ya que pondera más a las órdenes con más </w:t>
+      </w:r>
+      <w:r>
+        <w:t>productos.</w:t>
+      </w:r>
+    </w:p>
+    <w:p>
+      <w:pPr>
+        <w:pStyle w:val="Ttulo2"/>
       </w:pPr>
       <w:r>
         <w:t>4.5 Tipo de esquema</w:t>
@@ -3786,7 +3729,7 @@
     </w:p>
     <w:p>
       <w:pPr>
-        <w:pStyle w:val="ListParagraph"/>
+        <w:pStyle w:val="Prrafodelista"/>
         <w:numPr>
           <w:ilvl w:val="0"/>
           <w:numId w:val="2"/>
@@ -3794,12 +3737,15 @@
         <w:jc w:val="both"/>
       </w:pPr>
       <w:r>
-        <w:t>Las dimensiones son pequeñas (la de mayor tamaño tiene 91 registros), por lo que repetir la categoría o el proveedor en cada producto no tiene un costo relevante.</w:t>
-      </w:r>
-    </w:p>
-    <w:p>
-      <w:pPr>
-        <w:pStyle w:val="ListParagraph"/>
+        <w:t>Las dimensiones son pequeñas (la de mayor tamaño tiene 91 registros), por lo que repetir la categoría o el proveedor en cada producto no t</w:t>
+      </w:r>
+      <w:r>
+        <w:t>iene un costo relevante.</w:t>
+      </w:r>
+    </w:p>
+    <w:p>
+      <w:pPr>
+        <w:pStyle w:val="Prrafodelista"/>
         <w:numPr>
           <w:ilvl w:val="0"/>
           <w:numId w:val="2"/>
@@ -3812,7 +3758,7 @@
     </w:p>
     <w:p>
       <w:pPr>
-        <w:pStyle w:val="ListParagraph"/>
+        <w:pStyle w:val="Prrafodelista"/>
         <w:numPr>
           <w:ilvl w:val="0"/>
           <w:numId w:val="2"/>
@@ -3833,7 +3779,7 @@
     </w:p>
     <w:p>
       <w:pPr>
-        <w:pStyle w:val="ListParagraph"/>
+        <w:pStyle w:val="Prrafodelista"/>
         <w:numPr>
           <w:ilvl w:val="0"/>
           <w:numId w:val="2"/>
@@ -3841,12 +3787,15 @@
         <w:jc w:val="both"/>
       </w:pPr>
       <w:r>
-        <w:t>Un copo de nieve agregaría tablas y pasos al proceso ETL sin aportar nuevas posibilidades de análisis.</w:t>
-      </w:r>
-    </w:p>
-    <w:p>
-      <w:pPr>
-        <w:pStyle w:val="Heading2"/>
+        <w:t>Un copo de niev</w:t>
+      </w:r>
+      <w:r>
+        <w:t>e agregaría tablas y pasos al proceso ETL sin aportar nuevas posibilidades de análisis.</w:t>
+      </w:r>
+    </w:p>
+    <w:p>
+      <w:pPr>
+        <w:pStyle w:val="Ttulo2"/>
       </w:pPr>
       <w:r>
         <w:t>4.6 Diagrama del modelo dimensional</w:t>
@@ -3865,7 +3814,10 @@
       </w:r>
       <w:proofErr w:type="spellEnd"/>
       <w:r>
-        <w:t xml:space="preserve"> en SQL Server Management Studio, con la tabla de hechos al centro y sus relaciones con las cinco dimensiones.</w:t>
+        <w:t xml:space="preserve"> en SQ</w:t>
+      </w:r>
+      <w:r>
+        <w:t>L Server Management Studio, con la tabla de hechos al centro y sus relaciones con las cinco dimensiones.</w:t>
       </w:r>
     </w:p>
     <w:p>
@@ -3935,7 +3887,7 @@
     </w:p>
     <w:p>
       <w:pPr>
-        <w:pStyle w:val="Heading2"/>
+        <w:pStyle w:val="Ttulo2"/>
       </w:pPr>
       <w:r>
         <w:t>4.7 Decisiones de diseño</w:t>
@@ -3946,12 +3898,15 @@
         <w:jc w:val="both"/>
       </w:pPr>
       <w:r>
-        <w:t>Durante el diseño se excluyeron algunos elementos de la base transaccional con el fin de mantener un modelo simple y correcto:</w:t>
-      </w:r>
-    </w:p>
-    <w:p>
-      <w:pPr>
-        <w:pStyle w:val="ListParagraph"/>
+        <w:t>Durante el diseño se excluyeron algunos elementos de la base transaccion</w:t>
+      </w:r>
+      <w:r>
+        <w:t>al con el fin de mantener un modelo simple y correcto:</w:t>
+      </w:r>
+    </w:p>
+    <w:p>
+      <w:pPr>
+        <w:pStyle w:val="Prrafodelista"/>
         <w:numPr>
           <w:ilvl w:val="0"/>
           <w:numId w:val="2"/>
@@ -3959,12 +3914,15 @@
         <w:jc w:val="both"/>
       </w:pPr>
       <w:r>
-        <w:t>Territorios y regiones: un empleado tiene varios territorios y la orden no indica en cuál se realizó la venta. Incluirlos requeriría una tabla puente y provocaría un doble conteo de las ventas. La ubicación geográfica ya se analiza mediante el país y la ciudad del cliente y del empleado.</w:t>
-      </w:r>
-    </w:p>
-    <w:p>
-      <w:pPr>
-        <w:pStyle w:val="ListParagraph"/>
+        <w:t>Territorios y regiones: un empleado tiene varios territorios y la orden no indica en cuál se realizó la venta. Incluirlos requeriría una tabla puente y provocaría un doble conteo de las ventas. La ubic</w:t>
+      </w:r>
+      <w:r>
+        <w:t>ación geográfica ya se analiza mediante el país y la ciudad del cliente y del empleado.</w:t>
+      </w:r>
+    </w:p>
+    <w:p>
+      <w:pPr>
+        <w:pStyle w:val="Prrafodelista"/>
         <w:numPr>
           <w:ilvl w:val="0"/>
           <w:numId w:val="2"/>
@@ -3977,7 +3935,7 @@
     </w:p>
     <w:p>
       <w:pPr>
-        <w:pStyle w:val="ListParagraph"/>
+        <w:pStyle w:val="Prrafodelista"/>
         <w:numPr>
           <w:ilvl w:val="0"/>
           <w:numId w:val="2"/>
@@ -3985,12 +3943,15 @@
         <w:jc w:val="both"/>
       </w:pPr>
       <w:r>
-        <w:t>Tabla de hechos separada para envíos: no es necesaria, porque las fechas de envío y los días de despacho se ajustan al mismo nivel de granularidad.</w:t>
-      </w:r>
-    </w:p>
-    <w:p>
-      <w:pPr>
-        <w:pStyle w:val="ListParagraph"/>
+        <w:t>Tabla de hechos separada para envíos: no es necesaria, p</w:t>
+      </w:r>
+      <w:r>
+        <w:t>orque las fechas de envío y los días de despacho se ajustan al mismo nivel de granularidad.</w:t>
+      </w:r>
+    </w:p>
+    <w:p>
+      <w:pPr>
+        <w:pStyle w:val="Prrafodelista"/>
         <w:numPr>
           <w:ilvl w:val="0"/>
           <w:numId w:val="2"/>
@@ -4003,7 +3964,7 @@
     </w:p>
     <w:p>
       <w:pPr>
-        <w:pStyle w:val="Heading2"/>
+        <w:pStyle w:val="Ttulo2"/>
       </w:pPr>
       <w:r>
         <w:lastRenderedPageBreak/>
@@ -4015,7 +3976,10 @@
         <w:jc w:val="both"/>
       </w:pPr>
       <w:r>
-        <w:t xml:space="preserve">El modelo se implementó en SQL Server mediante el script 01_crear_modelo_dimensional.sql, que crea una base de datos independiente denominada </w:t>
+        <w:t>El modelo se implementó en SQL Server mediante el sc</w:t>
+      </w:r>
+      <w:r>
+        <w:t xml:space="preserve">ript 01_crear_modelo_dimensional.sql, que crea una base de datos independiente denominada </w:t>
       </w:r>
       <w:proofErr w:type="spellStart"/>
       <w:r>
@@ -4028,7 +3992,7 @@
     </w:p>
     <w:p>
       <w:pPr>
-        <w:pStyle w:val="ListParagraph"/>
+        <w:pStyle w:val="Prrafodelista"/>
         <w:numPr>
           <w:ilvl w:val="0"/>
           <w:numId w:val="2"/>
@@ -4040,7 +4004,10 @@
       </w:r>
       <w:proofErr w:type="spellStart"/>
       <w:r>
-        <w:t>KentFoodsDW</w:t>
+        <w:t>Ke</w:t>
+      </w:r>
+      <w:r>
+        <w:t>ntFoodsDW</w:t>
       </w:r>
       <w:proofErr w:type="spellEnd"/>
       <w:r>
@@ -4049,7 +4016,7 @@
     </w:p>
     <w:p>
       <w:pPr>
-        <w:pStyle w:val="ListParagraph"/>
+        <w:pStyle w:val="Prrafodelista"/>
         <w:numPr>
           <w:ilvl w:val="0"/>
           <w:numId w:val="2"/>
@@ -4065,12 +4032,18 @@
       </w:r>
       <w:proofErr w:type="spellEnd"/>
       <w:r>
-        <w:t>, propia del modelo e independiente del sistema de origen, y conserva la clave natural del origen para que el proceso ETL pueda buscar la clave sustituta al cargar los hechos. Los cambios en las dimensiones se manejan como dimensión lentamente cambiante de tipo 1, es decir, se sobrescriben, ya que la base de origen no guarda historial.</w:t>
-      </w:r>
-    </w:p>
-    <w:p>
-      <w:pPr>
-        <w:pStyle w:val="ListParagraph"/>
+        <w:t xml:space="preserve">, propia del modelo e independiente del sistema de origen, y conserva </w:t>
+      </w:r>
+      <w:r>
+        <w:t>la clave natural del origen para que el proceso ETL pueda buscar la clave sustituta al cargar los hechos. Los cambios en las dimensiones se manejan como dimensión lentamente cambiante de tipo 1, es decir, se sobrescriben, ya que la base de origen no guarda</w:t>
+      </w:r>
+      <w:r>
+        <w:t xml:space="preserve"> historial.</w:t>
+      </w:r>
+    </w:p>
+    <w:p>
+      <w:pPr>
+        <w:pStyle w:val="Prrafodelista"/>
         <w:numPr>
           <w:ilvl w:val="0"/>
           <w:numId w:val="2"/>
@@ -4083,7 +4056,7 @@
     </w:p>
     <w:p>
       <w:pPr>
-        <w:pStyle w:val="ListParagraph"/>
+        <w:pStyle w:val="Prrafodelista"/>
         <w:numPr>
           <w:ilvl w:val="0"/>
           <w:numId w:val="2"/>
@@ -4099,12 +4072,18 @@
       </w:r>
       <w:proofErr w:type="spellEnd"/>
       <w:r>
-        <w:t xml:space="preserve"> con una clave primaria compuesta por el número de orden y la clave del producto, que representa exactamente el nivel de granularidad definido y evita la carga de líneas duplicadas. La tabla incluye siete claves foráneas hacia las dimensiones, dos de ellas hacia la dimensión tiempo, y almacena los montos con tipo decimal para evitar errores de redondeo.</w:t>
-      </w:r>
-    </w:p>
-    <w:p>
-      <w:pPr>
-        <w:pStyle w:val="ListParagraph"/>
+        <w:t xml:space="preserve"> con una clave</w:t>
+      </w:r>
+      <w:r>
+        <w:t xml:space="preserve"> primaria compuesta por el número de orden y la clave del producto, que representa exactamente el nivel de granularidad definido y evita la carga de líneas duplicadas. La tabla incluye siete claves foráneas hacia las dimensiones, dos de ellas hacia la dime</w:t>
+      </w:r>
+      <w:r>
+        <w:t>nsión tiempo, y almacena los montos con tipo decimal para evitar errores de redondeo.</w:t>
+      </w:r>
+    </w:p>
+    <w:p>
+      <w:pPr>
+        <w:pStyle w:val="Prrafodelista"/>
         <w:numPr>
           <w:ilvl w:val="0"/>
           <w:numId w:val="2"/>
@@ -4112,7 +4091,10 @@
         <w:jc w:val="both"/>
       </w:pPr>
       <w:r>
-        <w:t>Carga la dimensión tiempo con todos los días entre el 1 de enero de 2016 y el 31 de diciembre de 2018, más el registro especial "Sin fecha". Los nombres de meses y días se generan en español, independientemente del idioma configurado en el servidor. Es la única dimensión que se carga mediante el script, ya que no proviene de la base de origen.</w:t>
+        <w:t>Carga la dimensión tiempo con todos los días entre el 1 de enero de 2016 y el 31 de diciembre de 2018, más el registro especial "Sin fecha". Los nombres de meses y días s</w:t>
+      </w:r>
+      <w:r>
+        <w:t>e generan en español, independientemente del idioma configurado en el servidor. Es la única dimensión que se carga mediante el script, ya que no proviene de la base de origen.</w:t>
       </w:r>
     </w:p>
     <w:p>
@@ -4120,195 +4102,1268 @@
         <w:jc w:val="both"/>
       </w:pPr>
       <w:r>
-        <w:t>Adicionalmente, el script 02_validacion_carga.sql compara la base de origen con el modelo dimensional una vez ejecutado el proceso ETL. Los valores esperados son 91 clientes, 77 productos, 9 empleados, 3 transportistas, 2.155 filas en la tabla de hechos, 830 órdenes distintas y un monto neto total de 1.265.792,76.</w:t>
-      </w:r>
-    </w:p>
-    <w:p>
-      <w:pPr>
-        <w:pStyle w:val="Heading2"/>
-      </w:pPr>
-      <w:r>
+        <w:t xml:space="preserve">Adicionalmente, el script 02_validacion_carga.sql compara la base de origen con </w:t>
+      </w:r>
+      <w:r>
+        <w:t>el modelo dimensional una vez ejecutado el proceso ETL. Los valores esperados son 91 clientes, 77 productos, 9 empleados, 3 transportistas, 2.155 filas en la tabla de hechos, 830 órdenes distintas y un monto neto total de 1.265.792,76.</w:t>
+      </w:r>
+    </w:p>
+    <w:p>
+      <w:pPr>
+        <w:pStyle w:val="Ttulo2"/>
+      </w:pPr>
+      <w:r>
+        <w:lastRenderedPageBreak/>
         <w:t>5. Proceso ETL</w:t>
       </w:r>
     </w:p>
     <w:p>
       <w:pPr>
+        <w:pStyle w:val="Ttulo2"/>
+        <w:rPr>
+          <w:color w:val="auto"/>
+        </w:rPr>
+      </w:pPr>
+      <w:r>
+        <w:rPr>
+          <w:color w:val="auto"/>
+        </w:rPr>
+        <w:t xml:space="preserve">El proceso de Extracción, Transformación y Carga (ETL) se implementó utilizando SQL Server </w:t>
+      </w:r>
+      <w:proofErr w:type="spellStart"/>
+      <w:r>
+        <w:rPr>
+          <w:color w:val="auto"/>
+        </w:rPr>
+        <w:t>Integration</w:t>
+      </w:r>
+      <w:proofErr w:type="spellEnd"/>
+      <w:r>
+        <w:rPr>
+          <w:color w:val="auto"/>
+        </w:rPr>
+        <w:t xml:space="preserve"> </w:t>
+      </w:r>
+      <w:proofErr w:type="spellStart"/>
+      <w:r>
+        <w:rPr>
+          <w:color w:val="auto"/>
+        </w:rPr>
+        <w:t>Services</w:t>
+      </w:r>
+      <w:proofErr w:type="spellEnd"/>
+      <w:r>
+        <w:rPr>
+          <w:color w:val="auto"/>
+        </w:rPr>
+        <w:t xml:space="preserve"> (SSIS) dentro de Microsoft Visual Studio. El objetivo de este proceso es mover los datos desde la base transaccional </w:t>
+      </w:r>
+      <w:proofErr w:type="spellStart"/>
+      <w:r>
+        <w:rPr>
+          <w:color w:val="auto"/>
+        </w:rPr>
+        <w:t>KentFoods</w:t>
+      </w:r>
+      <w:proofErr w:type="spellEnd"/>
+      <w:r>
+        <w:rPr>
+          <w:color w:val="auto"/>
+        </w:rPr>
+        <w:t xml:space="preserve"> hacia el modelo dimensional </w:t>
+      </w:r>
+      <w:proofErr w:type="spellStart"/>
+      <w:r>
+        <w:rPr>
+          <w:color w:val="auto"/>
+        </w:rPr>
+        <w:t>KentFoodsDW</w:t>
+      </w:r>
+      <w:proofErr w:type="spellEnd"/>
+      <w:r>
+        <w:rPr>
+          <w:color w:val="auto"/>
+        </w:rPr>
+        <w:t xml:space="preserve">, aplicando las reglas de negocio y transformaciones definidas durante el diseño. El paquete principal, denominado </w:t>
+      </w:r>
+      <w:proofErr w:type="spellStart"/>
+      <w:r>
+        <w:rPr>
+          <w:color w:val="auto"/>
+        </w:rPr>
+        <w:t>Main.dtsx</w:t>
+      </w:r>
+      <w:proofErr w:type="spellEnd"/>
+      <w:r>
+        <w:rPr>
+          <w:color w:val="auto"/>
+        </w:rPr>
+        <w:t>, orquesta las tareas en el siguiente orden:</w:t>
+      </w:r>
+    </w:p>
+    <w:p>
+      <w:pPr>
+        <w:rPr>
+          <w:b/>
+          <w:bCs/>
+          <w:lang w:val="es-CL"/>
+        </w:rPr>
+      </w:pPr>
+      <w:r>
+        <w:rPr>
+          <w:b/>
+          <w:bCs/>
+          <w:lang w:val="es-CL"/>
+        </w:rPr>
+        <w:t>5.1. Flujo de control (Control Flow)</w:t>
+      </w:r>
+    </w:p>
+    <w:p>
+      <w:pPr>
+        <w:rPr>
+          <w:lang w:val="es-CL"/>
+        </w:rPr>
+      </w:pPr>
+      <w:r>
+        <w:rPr>
+          <w:lang w:val="es-CL"/>
+        </w:rPr>
+        <w:t>El flujo de control define la secuencia de ejecución de las tareas. Se estructuró de la siguiente manera:</w:t>
+      </w:r>
+    </w:p>
+    <w:p>
+      <w:pPr>
+        <w:numPr>
+          <w:ilvl w:val="0"/>
+          <w:numId w:val="3"/>
+        </w:numPr>
+        <w:rPr>
+          <w:lang w:val="es-CL"/>
+        </w:rPr>
+      </w:pPr>
+      <w:r>
+        <w:rPr>
+          <w:b/>
+          <w:bCs/>
+          <w:lang w:val="es-CL"/>
+        </w:rPr>
+        <w:t>Limpieza del entorno analítico:</w:t>
+      </w:r>
+      <w:r>
+        <w:rPr>
+          <w:lang w:val="es-CL"/>
+        </w:rPr>
+        <w:t xml:space="preserve"> Se ejecuta una tarea SQL (</w:t>
+      </w:r>
+      <w:proofErr w:type="spellStart"/>
+      <w:r>
+        <w:rPr>
+          <w:lang w:val="es-CL"/>
+        </w:rPr>
+        <w:t>SQL_Delete_Tablas</w:t>
+      </w:r>
+      <w:proofErr w:type="spellEnd"/>
+      <w:r>
+        <w:rPr>
+          <w:lang w:val="es-CL"/>
+        </w:rPr>
+        <w:t xml:space="preserve">) que elimina los registros existentes en las tablas del Data </w:t>
+      </w:r>
+      <w:proofErr w:type="spellStart"/>
+      <w:r>
+        <w:rPr>
+          <w:lang w:val="es-CL"/>
+        </w:rPr>
+        <w:t>Warehouse</w:t>
+      </w:r>
+      <w:proofErr w:type="spellEnd"/>
+      <w:r>
+        <w:rPr>
+          <w:lang w:val="es-CL"/>
+        </w:rPr>
+        <w:t>. Se utilizó la instrucción DELETE en lugar de TRUNCATE para respetar las restricciones de clave foránea establecidas en el modelo dimensional.</w:t>
+      </w:r>
+    </w:p>
+    <w:p>
+      <w:pPr>
+        <w:numPr>
+          <w:ilvl w:val="0"/>
+          <w:numId w:val="3"/>
+        </w:numPr>
+        <w:rPr>
+          <w:lang w:val="es-CL"/>
+        </w:rPr>
+      </w:pPr>
+      <w:r>
+        <w:rPr>
+          <w:b/>
+          <w:bCs/>
+          <w:lang w:val="es-CL"/>
+        </w:rPr>
+        <w:t>Carga de dimensiones:</w:t>
+      </w:r>
+      <w:r>
+        <w:rPr>
+          <w:lang w:val="es-CL"/>
+        </w:rPr>
+        <w:t xml:space="preserve"> Se ejecutan cuatro tareas de flujo de datos (</w:t>
+      </w:r>
+      <w:proofErr w:type="spellStart"/>
+      <w:r>
+        <w:rPr>
+          <w:lang w:val="es-CL"/>
+        </w:rPr>
+        <w:t>DFT_Carga_Dim</w:t>
+      </w:r>
+      <w:proofErr w:type="spellEnd"/>
+      <w:r>
+        <w:rPr>
+          <w:lang w:val="es-CL"/>
+        </w:rPr>
+        <w:t>...) que poblaron las dimensiones Cliente, Transportista, Empleado y Producto.</w:t>
+      </w:r>
+    </w:p>
+    <w:p>
+      <w:pPr>
+        <w:numPr>
+          <w:ilvl w:val="0"/>
+          <w:numId w:val="3"/>
+        </w:numPr>
+        <w:rPr>
+          <w:lang w:val="es-CL"/>
+        </w:rPr>
+      </w:pPr>
+      <w:r>
+        <w:rPr>
+          <w:b/>
+          <w:bCs/>
+          <w:lang w:val="es-CL"/>
+        </w:rPr>
+        <w:t>Carga de la tabla de hechos:</w:t>
+      </w:r>
+      <w:r>
+        <w:rPr>
+          <w:lang w:val="es-CL"/>
+        </w:rPr>
+        <w:t xml:space="preserve"> Una vez que las dimensiones contienen las claves sustitutas necesarias, se ejecuta la tarea </w:t>
+      </w:r>
+      <w:proofErr w:type="spellStart"/>
+      <w:r>
+        <w:rPr>
+          <w:lang w:val="es-CL"/>
+        </w:rPr>
+        <w:t>DFT_Carga_FACTVentas</w:t>
+      </w:r>
+      <w:proofErr w:type="spellEnd"/>
+      <w:r>
+        <w:rPr>
+          <w:lang w:val="es-CL"/>
+        </w:rPr>
+        <w:t>.</w:t>
+      </w:r>
+    </w:p>
+    <w:p>
+      <w:pPr>
+        <w:numPr>
+          <w:ilvl w:val="0"/>
+          <w:numId w:val="3"/>
+        </w:numPr>
+        <w:rPr>
+          <w:lang w:val="es-CL"/>
+        </w:rPr>
+      </w:pPr>
+      <w:r>
+        <w:rPr>
+          <w:b/>
+          <w:bCs/>
+          <w:lang w:val="es-CL"/>
+        </w:rPr>
+        <w:t>Validación automática:</w:t>
+      </w:r>
+      <w:r>
+        <w:rPr>
+          <w:lang w:val="es-CL"/>
+        </w:rPr>
+        <w:t xml:space="preserve"> Como paso final, se ejecuta una tarea SQL que invoca el script de validación para comparar los conteos y sumas entre el origen y el destino.</w:t>
+      </w:r>
+    </w:p>
+    <w:p>
+      <w:pPr>
+        <w:rPr>
+          <w:b/>
+          <w:bCs/>
+          <w:lang w:val="es-CL"/>
+        </w:rPr>
+      </w:pPr>
+      <w:r>
+        <w:rPr>
+          <w:b/>
+          <w:bCs/>
+          <w:lang w:val="es-CL"/>
+        </w:rPr>
+        <w:t>5.2. Transformaciones en las dimensiones</w:t>
+      </w:r>
+    </w:p>
+    <w:p>
+      <w:pPr>
+        <w:rPr>
+          <w:lang w:val="es-CL"/>
+        </w:rPr>
+      </w:pPr>
+      <w:r>
+        <w:rPr>
+          <w:lang w:val="es-CL"/>
+        </w:rPr>
+        <w:t>Para las dimensiones simples (Cliente, Empleado y Transportista), el flujo de datos consistió en un origen OLE DB y un destino OLE DB con mapeo directo de columnas.</w:t>
+      </w:r>
+    </w:p>
+    <w:p>
+      <w:pPr>
+        <w:numPr>
+          <w:ilvl w:val="0"/>
+          <w:numId w:val="4"/>
+        </w:numPr>
+        <w:rPr>
+          <w:lang w:val="es-CL"/>
+        </w:rPr>
+      </w:pPr>
+      <w:proofErr w:type="spellStart"/>
+      <w:r>
+        <w:rPr>
+          <w:b/>
+          <w:bCs/>
+          <w:lang w:val="es-CL"/>
+        </w:rPr>
+        <w:t>DimEmpleado</w:t>
+      </w:r>
+      <w:proofErr w:type="spellEnd"/>
+      <w:r>
+        <w:rPr>
+          <w:b/>
+          <w:bCs/>
+          <w:lang w:val="es-CL"/>
+        </w:rPr>
+        <w:t>:</w:t>
+      </w:r>
+      <w:r>
+        <w:rPr>
+          <w:lang w:val="es-CL"/>
+        </w:rPr>
+        <w:t xml:space="preserve"> Dado que la base transaccional almacena el nombre y el apellido en columnas separadas, se insertó un componente de </w:t>
+      </w:r>
+      <w:r>
+        <w:rPr>
+          <w:i/>
+          <w:iCs/>
+          <w:lang w:val="es-CL"/>
+        </w:rPr>
+        <w:t>Columna Derivada</w:t>
+      </w:r>
+      <w:r>
+        <w:rPr>
+          <w:lang w:val="es-CL"/>
+        </w:rPr>
+        <w:t xml:space="preserve"> (</w:t>
+      </w:r>
+      <w:proofErr w:type="spellStart"/>
+      <w:r>
+        <w:rPr>
+          <w:lang w:val="es-CL"/>
+        </w:rPr>
+        <w:t>Derived</w:t>
+      </w:r>
+      <w:proofErr w:type="spellEnd"/>
+      <w:r>
+        <w:rPr>
+          <w:lang w:val="es-CL"/>
+        </w:rPr>
+        <w:t xml:space="preserve"> </w:t>
+      </w:r>
+      <w:proofErr w:type="spellStart"/>
+      <w:r>
+        <w:rPr>
+          <w:lang w:val="es-CL"/>
+        </w:rPr>
+        <w:t>Column</w:t>
+      </w:r>
+      <w:proofErr w:type="spellEnd"/>
+      <w:r>
+        <w:rPr>
+          <w:lang w:val="es-CL"/>
+        </w:rPr>
+        <w:t xml:space="preserve">) para concatenar ambos campos en la columna </w:t>
+      </w:r>
+      <w:proofErr w:type="spellStart"/>
+      <w:r>
+        <w:rPr>
+          <w:lang w:val="es-CL"/>
+        </w:rPr>
+        <w:t>NombreCompleto</w:t>
+      </w:r>
+      <w:proofErr w:type="spellEnd"/>
+      <w:r>
+        <w:rPr>
+          <w:lang w:val="es-CL"/>
+        </w:rPr>
+        <w:t xml:space="preserve"> requerida por el modelo.</w:t>
+      </w:r>
+    </w:p>
+    <w:p>
+      <w:pPr>
+        <w:numPr>
+          <w:ilvl w:val="0"/>
+          <w:numId w:val="4"/>
+        </w:numPr>
+        <w:rPr>
+          <w:lang w:val="es-CL"/>
+        </w:rPr>
+      </w:pPr>
+      <w:proofErr w:type="spellStart"/>
+      <w:r>
+        <w:rPr>
+          <w:b/>
+          <w:bCs/>
+          <w:lang w:val="es-CL"/>
+        </w:rPr>
+        <w:t>DimProducto</w:t>
+      </w:r>
+      <w:proofErr w:type="spellEnd"/>
+      <w:r>
+        <w:rPr>
+          <w:b/>
+          <w:bCs/>
+          <w:lang w:val="es-CL"/>
+        </w:rPr>
+        <w:t>:</w:t>
+      </w:r>
+      <w:r>
+        <w:rPr>
+          <w:lang w:val="es-CL"/>
+        </w:rPr>
+        <w:t xml:space="preserve"> Para cumplir con el esquema estrella y evitar un esquema de copo de nieve, se utilizó un comando SQL en el componente de origen. Este comando realizó un INNER JOIN entre las tablas Productos, </w:t>
+      </w:r>
+      <w:proofErr w:type="spellStart"/>
+      <w:r>
+        <w:rPr>
+          <w:lang w:val="es-CL"/>
+        </w:rPr>
+        <w:t>Categorias</w:t>
+      </w:r>
+      <w:proofErr w:type="spellEnd"/>
+      <w:r>
+        <w:rPr>
+          <w:lang w:val="es-CL"/>
+        </w:rPr>
+        <w:t xml:space="preserve"> y Proveedores, desnormalizando la información en un solo flujo de datos antes de cargarla en la dimensión.</w:t>
+      </w:r>
+    </w:p>
+    <w:p>
+      <w:pPr>
+        <w:rPr>
+          <w:b/>
+          <w:bCs/>
+          <w:lang w:val="es-CL"/>
+        </w:rPr>
+      </w:pPr>
+      <w:r>
+        <w:rPr>
+          <w:b/>
+          <w:bCs/>
+          <w:lang w:val="es-CL"/>
+        </w:rPr>
+        <w:lastRenderedPageBreak/>
+        <w:t>5.3. Carga de la tabla de hechos (</w:t>
+      </w:r>
+      <w:proofErr w:type="spellStart"/>
+      <w:r>
+        <w:rPr>
+          <w:b/>
+          <w:bCs/>
+          <w:lang w:val="es-CL"/>
+        </w:rPr>
+        <w:t>FactVentas</w:t>
+      </w:r>
+      <w:proofErr w:type="spellEnd"/>
+      <w:r>
+        <w:rPr>
+          <w:b/>
+          <w:bCs/>
+          <w:lang w:val="es-CL"/>
+        </w:rPr>
+        <w:t>)</w:t>
+      </w:r>
+    </w:p>
+    <w:p>
+      <w:pPr>
+        <w:rPr>
+          <w:lang w:val="es-CL"/>
+        </w:rPr>
+      </w:pPr>
+      <w:r>
+        <w:rPr>
+          <w:lang w:val="es-CL"/>
+        </w:rPr>
+        <w:t>La carga de la tabla de hechos requirió la mayor complejidad de transformaciones, estructurada en tres etapas dentro del flujo de datos:</w:t>
+      </w:r>
+    </w:p>
+    <w:p>
+      <w:pPr>
+        <w:numPr>
+          <w:ilvl w:val="0"/>
+          <w:numId w:val="5"/>
+        </w:numPr>
+        <w:rPr>
+          <w:lang w:val="es-CL"/>
+        </w:rPr>
+      </w:pPr>
+      <w:r>
+        <w:rPr>
+          <w:b/>
+          <w:bCs/>
+          <w:lang w:val="es-CL"/>
+        </w:rPr>
+        <w:t>Extracción y cálculos (</w:t>
+      </w:r>
+      <w:proofErr w:type="spellStart"/>
+      <w:r>
+        <w:rPr>
+          <w:b/>
+          <w:bCs/>
+          <w:lang w:val="es-CL"/>
+        </w:rPr>
+        <w:t>Source</w:t>
+      </w:r>
+      <w:proofErr w:type="spellEnd"/>
+      <w:r>
+        <w:rPr>
+          <w:b/>
+          <w:bCs/>
+          <w:lang w:val="es-CL"/>
+        </w:rPr>
+        <w:t xml:space="preserve"> y </w:t>
+      </w:r>
+      <w:proofErr w:type="spellStart"/>
+      <w:r>
+        <w:rPr>
+          <w:b/>
+          <w:bCs/>
+          <w:lang w:val="es-CL"/>
+        </w:rPr>
+        <w:t>Derived</w:t>
+      </w:r>
+      <w:proofErr w:type="spellEnd"/>
+      <w:r>
+        <w:rPr>
+          <w:b/>
+          <w:bCs/>
+          <w:lang w:val="es-CL"/>
+        </w:rPr>
+        <w:t xml:space="preserve"> </w:t>
+      </w:r>
+      <w:proofErr w:type="spellStart"/>
+      <w:r>
+        <w:rPr>
+          <w:b/>
+          <w:bCs/>
+          <w:lang w:val="es-CL"/>
+        </w:rPr>
+        <w:t>Column</w:t>
+      </w:r>
+      <w:proofErr w:type="spellEnd"/>
+      <w:r>
+        <w:rPr>
+          <w:b/>
+          <w:bCs/>
+          <w:lang w:val="es-CL"/>
+        </w:rPr>
+        <w:t>):</w:t>
+      </w:r>
+      <w:r>
+        <w:rPr>
+          <w:lang w:val="es-CL"/>
+        </w:rPr>
+        <w:t xml:space="preserve"> Se extrajeron los datos uniendo las tablas </w:t>
+      </w:r>
+      <w:proofErr w:type="spellStart"/>
+      <w:r>
+        <w:rPr>
+          <w:lang w:val="es-CL"/>
+        </w:rPr>
+        <w:t>DetalleOrden</w:t>
+      </w:r>
+      <w:proofErr w:type="spellEnd"/>
+      <w:r>
+        <w:rPr>
+          <w:lang w:val="es-CL"/>
+        </w:rPr>
+        <w:t xml:space="preserve"> y Ordenes. Posteriormente, mediante dos componentes de </w:t>
+      </w:r>
+      <w:r>
+        <w:rPr>
+          <w:i/>
+          <w:iCs/>
+          <w:lang w:val="es-CL"/>
+        </w:rPr>
+        <w:t>Columna Derivada</w:t>
+      </w:r>
+      <w:r>
+        <w:rPr>
+          <w:lang w:val="es-CL"/>
+        </w:rPr>
+        <w:t xml:space="preserve">, se calcularon las medidas que no existían en el origen: </w:t>
+      </w:r>
+      <w:proofErr w:type="spellStart"/>
+      <w:r>
+        <w:rPr>
+          <w:lang w:val="es-CL"/>
+        </w:rPr>
+        <w:t>MontoBruto</w:t>
+      </w:r>
+      <w:proofErr w:type="spellEnd"/>
+      <w:r>
+        <w:rPr>
+          <w:lang w:val="es-CL"/>
+        </w:rPr>
+        <w:t xml:space="preserve"> (Cantidad × </w:t>
+      </w:r>
+      <w:proofErr w:type="spellStart"/>
+      <w:r>
+        <w:rPr>
+          <w:lang w:val="es-CL"/>
+        </w:rPr>
+        <w:t>PrecioUnitario</w:t>
+      </w:r>
+      <w:proofErr w:type="spellEnd"/>
+      <w:r>
+        <w:rPr>
+          <w:lang w:val="es-CL"/>
+        </w:rPr>
+        <w:t xml:space="preserve">), </w:t>
+      </w:r>
+      <w:proofErr w:type="spellStart"/>
+      <w:r>
+        <w:rPr>
+          <w:lang w:val="es-CL"/>
+        </w:rPr>
+        <w:t>MontoDescuento</w:t>
+      </w:r>
+      <w:proofErr w:type="spellEnd"/>
+      <w:r>
+        <w:rPr>
+          <w:lang w:val="es-CL"/>
+        </w:rPr>
+        <w:t xml:space="preserve"> y </w:t>
+      </w:r>
+      <w:proofErr w:type="spellStart"/>
+      <w:r>
+        <w:rPr>
+          <w:lang w:val="es-CL"/>
+        </w:rPr>
+        <w:t>MontoNeto</w:t>
+      </w:r>
+      <w:proofErr w:type="spellEnd"/>
+      <w:r>
+        <w:rPr>
+          <w:lang w:val="es-CL"/>
+        </w:rPr>
+        <w:t xml:space="preserve">. Asimismo, se calculó la medida </w:t>
+      </w:r>
+      <w:proofErr w:type="spellStart"/>
+      <w:r>
+        <w:rPr>
+          <w:lang w:val="es-CL"/>
+        </w:rPr>
+        <w:t>DiasDespacho</w:t>
+      </w:r>
+      <w:proofErr w:type="spellEnd"/>
+      <w:r>
+        <w:rPr>
+          <w:lang w:val="es-CL"/>
+        </w:rPr>
+        <w:t xml:space="preserve"> utilizando una expresión condicional que asigna el valor 0 cuando la </w:t>
+      </w:r>
+      <w:proofErr w:type="spellStart"/>
+      <w:r>
+        <w:rPr>
+          <w:lang w:val="es-CL"/>
+        </w:rPr>
+        <w:t>FechaEnvio</w:t>
+      </w:r>
+      <w:proofErr w:type="spellEnd"/>
+      <w:r>
+        <w:rPr>
+          <w:lang w:val="es-CL"/>
+        </w:rPr>
+        <w:t xml:space="preserve"> es nula.</w:t>
+      </w:r>
+    </w:p>
+    <w:p>
+      <w:pPr>
+        <w:numPr>
+          <w:ilvl w:val="0"/>
+          <w:numId w:val="5"/>
+        </w:numPr>
+        <w:rPr>
+          <w:lang w:val="es-CL"/>
+        </w:rPr>
+      </w:pPr>
+      <w:r>
+        <w:rPr>
+          <w:b/>
+          <w:bCs/>
+          <w:lang w:val="es-CL"/>
+        </w:rPr>
+        <w:t>Búsqueda de claves sustitutas (</w:t>
+      </w:r>
+      <w:proofErr w:type="spellStart"/>
+      <w:r>
+        <w:rPr>
+          <w:b/>
+          <w:bCs/>
+          <w:lang w:val="es-CL"/>
+        </w:rPr>
+        <w:t>Lookups</w:t>
+      </w:r>
+      <w:proofErr w:type="spellEnd"/>
+      <w:r>
+        <w:rPr>
+          <w:b/>
+          <w:bCs/>
+          <w:lang w:val="es-CL"/>
+        </w:rPr>
+        <w:t>):</w:t>
+      </w:r>
+      <w:r>
+        <w:rPr>
+          <w:lang w:val="es-CL"/>
+        </w:rPr>
+        <w:t xml:space="preserve"> Se configuraron seis componentes de </w:t>
+      </w:r>
+      <w:r>
+        <w:rPr>
+          <w:i/>
+          <w:iCs/>
+          <w:lang w:val="es-CL"/>
+        </w:rPr>
+        <w:t>Búsqueda</w:t>
+      </w:r>
+      <w:r>
+        <w:rPr>
+          <w:lang w:val="es-CL"/>
+        </w:rPr>
+        <w:t xml:space="preserve"> (</w:t>
+      </w:r>
+      <w:proofErr w:type="spellStart"/>
+      <w:r>
+        <w:rPr>
+          <w:lang w:val="es-CL"/>
+        </w:rPr>
+        <w:t>Lookup</w:t>
+      </w:r>
+      <w:proofErr w:type="spellEnd"/>
+      <w:r>
+        <w:rPr>
+          <w:lang w:val="es-CL"/>
+        </w:rPr>
+        <w:t xml:space="preserve">) en cascada. Cada uno toma la clave natural del flujo (por ejemplo, </w:t>
+      </w:r>
+      <w:proofErr w:type="spellStart"/>
+      <w:r>
+        <w:rPr>
+          <w:lang w:val="es-CL"/>
+        </w:rPr>
+        <w:t>ClienteID</w:t>
+      </w:r>
+      <w:proofErr w:type="spellEnd"/>
+      <w:r>
+        <w:rPr>
+          <w:lang w:val="es-CL"/>
+        </w:rPr>
+        <w:t xml:space="preserve">) y busca en la dimensión correspondiente para obtener la clave sustituta (por ejemplo, </w:t>
+      </w:r>
+      <w:proofErr w:type="spellStart"/>
+      <w:r>
+        <w:rPr>
+          <w:lang w:val="es-CL"/>
+        </w:rPr>
+        <w:t>ClienteKey</w:t>
+      </w:r>
+      <w:proofErr w:type="spellEnd"/>
+      <w:r>
+        <w:rPr>
+          <w:lang w:val="es-CL"/>
+        </w:rPr>
+        <w:t>). Se configuró la opción de "</w:t>
+      </w:r>
+      <w:proofErr w:type="spellStart"/>
+      <w:r>
+        <w:rPr>
+          <w:lang w:val="es-CL"/>
+        </w:rPr>
+        <w:t>Fail</w:t>
+      </w:r>
+      <w:proofErr w:type="spellEnd"/>
+      <w:r>
+        <w:rPr>
+          <w:lang w:val="es-CL"/>
+        </w:rPr>
+        <w:t xml:space="preserve"> </w:t>
+      </w:r>
+      <w:proofErr w:type="spellStart"/>
+      <w:r>
+        <w:rPr>
+          <w:lang w:val="es-CL"/>
+        </w:rPr>
+        <w:t>component</w:t>
+      </w:r>
+      <w:proofErr w:type="spellEnd"/>
+      <w:r>
+        <w:rPr>
+          <w:lang w:val="es-CL"/>
+        </w:rPr>
+        <w:t>" para que el paquete detenga su ejecución en caso de encontrar una clave huérfana, garantizando la integridad referencial.</w:t>
+      </w:r>
+    </w:p>
+    <w:p>
+      <w:pPr>
+        <w:numPr>
+          <w:ilvl w:val="0"/>
+          <w:numId w:val="5"/>
+        </w:numPr>
+        <w:rPr>
+          <w:lang w:val="es-CL"/>
+        </w:rPr>
+      </w:pPr>
+      <w:r>
+        <w:rPr>
+          <w:b/>
+          <w:bCs/>
+          <w:lang w:val="es-CL"/>
+        </w:rPr>
+        <w:t>Manejo de la dimensión tiempo y fechas nulas:</w:t>
+      </w:r>
+      <w:r>
+        <w:rPr>
+          <w:lang w:val="es-CL"/>
+        </w:rPr>
+        <w:t xml:space="preserve"> Dado que la clave de </w:t>
+      </w:r>
+      <w:proofErr w:type="spellStart"/>
+      <w:r>
+        <w:rPr>
+          <w:lang w:val="es-CL"/>
+        </w:rPr>
+        <w:t>DimTiempo</w:t>
+      </w:r>
+      <w:proofErr w:type="spellEnd"/>
+      <w:r>
+        <w:rPr>
+          <w:lang w:val="es-CL"/>
+        </w:rPr>
+        <w:t xml:space="preserve"> tiene formato entero AAAAMMDD, se utilizó un componente de </w:t>
+      </w:r>
+      <w:r>
+        <w:rPr>
+          <w:i/>
+          <w:iCs/>
+          <w:lang w:val="es-CL"/>
+        </w:rPr>
+        <w:t>Columna Derivada</w:t>
+      </w:r>
+      <w:r>
+        <w:rPr>
+          <w:lang w:val="es-CL"/>
+        </w:rPr>
+        <w:t xml:space="preserve"> para convertir las fechas de origen a este formato numérico. Para el caso de las 21 órdenes que no tienen </w:t>
+      </w:r>
+      <w:proofErr w:type="spellStart"/>
+      <w:r>
+        <w:rPr>
+          <w:lang w:val="es-CL"/>
+        </w:rPr>
+        <w:t>FechaEnvio</w:t>
+      </w:r>
+      <w:proofErr w:type="spellEnd"/>
+      <w:r>
+        <w:rPr>
+          <w:lang w:val="es-CL"/>
+        </w:rPr>
+        <w:t>, se aplicó una expresión que asigna la clave -1 (el miembro especial "Sin fecha" creado en el script de inicialización), asegurando que estas órdenes se carguen correctamente en el hecho sin violar las claves foráneas.</w:t>
+      </w:r>
+    </w:p>
+    <w:p>
+      <w:pPr>
+        <w:rPr>
+          <w:b/>
+          <w:bCs/>
+          <w:lang w:val="es-CL"/>
+        </w:rPr>
+      </w:pPr>
+      <w:r>
+        <w:rPr>
+          <w:b/>
+          <w:bCs/>
+          <w:lang w:val="es-CL"/>
+        </w:rPr>
+        <w:t>5.4. Resultados y validación de la carga</w:t>
+      </w:r>
+    </w:p>
+    <w:p>
+      <w:pPr>
+        <w:rPr>
+          <w:lang w:val="es-CL"/>
+        </w:rPr>
+      </w:pPr>
+      <w:r>
+        <w:rPr>
+          <w:lang w:val="es-CL"/>
+        </w:rPr>
+        <w:t>Al ejecutar el paquete completo, el proceso cargó exitosamente los datos en el modelo dimensional. La validación automática, ejecutada mediante el script 02_validacion_carga.sql, confirmó que todos los controles arrojan el estado "OK".</w:t>
+      </w:r>
+    </w:p>
+    <w:p>
+      <w:pPr>
+        <w:rPr>
+          <w:lang w:val="es-CL"/>
+        </w:rPr>
+      </w:pPr>
+      <w:r>
+        <w:rPr>
+          <w:lang w:val="es-CL"/>
+        </w:rPr>
+        <w:t>Los resultados obtenidos coinciden exactamente con los valores de referencia definidos en el análisis de datos:</w:t>
+      </w:r>
+    </w:p>
+    <w:p>
+      <w:pPr>
+        <w:numPr>
+          <w:ilvl w:val="0"/>
+          <w:numId w:val="6"/>
+        </w:numPr>
+        <w:rPr>
+          <w:lang w:val="es-CL"/>
+        </w:rPr>
+      </w:pPr>
+      <w:r>
+        <w:rPr>
+          <w:b/>
+          <w:bCs/>
+          <w:lang w:val="es-CL"/>
+        </w:rPr>
+        <w:t>Dimensiones:</w:t>
+      </w:r>
+      <w:r>
+        <w:rPr>
+          <w:lang w:val="es-CL"/>
+        </w:rPr>
+        <w:t xml:space="preserve"> 91 clientes, 77 productos, 9 empleados y 3 transportistas.</w:t>
+      </w:r>
+    </w:p>
+    <w:p>
+      <w:pPr>
+        <w:numPr>
+          <w:ilvl w:val="0"/>
+          <w:numId w:val="6"/>
+        </w:numPr>
+        <w:rPr>
+          <w:lang w:val="es-CL"/>
+        </w:rPr>
+      </w:pPr>
+      <w:r>
+        <w:rPr>
+          <w:b/>
+          <w:bCs/>
+          <w:lang w:val="es-CL"/>
+        </w:rPr>
+        <w:t>Tabla de hechos:</w:t>
+      </w:r>
+      <w:r>
+        <w:rPr>
+          <w:lang w:val="es-CL"/>
+        </w:rPr>
+        <w:t xml:space="preserve"> 2.155 filas, correspondientes a la granularidad de línea de orden.</w:t>
+      </w:r>
+    </w:p>
+    <w:p>
+      <w:pPr>
+        <w:numPr>
+          <w:ilvl w:val="0"/>
+          <w:numId w:val="6"/>
+        </w:numPr>
+        <w:rPr>
+          <w:lang w:val="es-CL"/>
+        </w:rPr>
+      </w:pPr>
+      <w:r>
+        <w:rPr>
+          <w:b/>
+          <w:bCs/>
+          <w:lang w:val="es-CL"/>
+        </w:rPr>
+        <w:t>Integridad:</w:t>
+      </w:r>
+      <w:r>
+        <w:rPr>
+          <w:lang w:val="es-CL"/>
+        </w:rPr>
+        <w:t xml:space="preserve"> 830 órdenes distintas cargadas, incluyendo las 21 órdenes pendientes de envío mapeadas correctamente a la clave -1 de </w:t>
+      </w:r>
+      <w:proofErr w:type="spellStart"/>
+      <w:r>
+        <w:rPr>
+          <w:lang w:val="es-CL"/>
+        </w:rPr>
+        <w:t>DimTiempo</w:t>
+      </w:r>
+      <w:proofErr w:type="spellEnd"/>
+      <w:r>
+        <w:rPr>
+          <w:lang w:val="es-CL"/>
+        </w:rPr>
+        <w:t>.</w:t>
+      </w:r>
+    </w:p>
+    <w:p>
+      <w:pPr>
+        <w:numPr>
+          <w:ilvl w:val="0"/>
+          <w:numId w:val="6"/>
+        </w:numPr>
+        <w:rPr>
+          <w:lang w:val="es-CL"/>
+        </w:rPr>
+      </w:pPr>
+      <w:r>
+        <w:rPr>
+          <w:b/>
+          <w:bCs/>
+          <w:lang w:val="es-CL"/>
+        </w:rPr>
+        <w:lastRenderedPageBreak/>
+        <w:t>Métricas financieras:</w:t>
+      </w:r>
+      <w:r>
+        <w:rPr>
+          <w:lang w:val="es-CL"/>
+        </w:rPr>
+        <w:t xml:space="preserve"> La suma del </w:t>
+      </w:r>
+      <w:proofErr w:type="spellStart"/>
+      <w:r>
+        <w:rPr>
+          <w:lang w:val="es-CL"/>
+        </w:rPr>
+        <w:t>MontoNeto</w:t>
+      </w:r>
+      <w:proofErr w:type="spellEnd"/>
+      <w:r>
+        <w:rPr>
+          <w:lang w:val="es-CL"/>
+        </w:rPr>
+        <w:t xml:space="preserve"> en la tabla de hechos es de $1.265.792,76, validando que los cálculos de montos y descuentos se realizaron sin errores de redondeo.</w:t>
+      </w:r>
+    </w:p>
+    <w:p>
+      <w:pPr>
+        <w:rPr>
+          <w:lang w:val="es-CL"/>
+        </w:rPr>
+      </w:pPr>
+    </w:p>
+    <w:p>
+      <w:pPr>
+        <w:pStyle w:val="Ttulo2"/>
+      </w:pPr>
+      <w:r>
+        <w:t>6. Cubos OLAP</w:t>
+      </w:r>
+    </w:p>
+    <w:p>
+      <w:pPr>
         <w:jc w:val="both"/>
       </w:pPr>
       <w:r>
-        <w:t>[Sección a completar con el desarrollo del proceso ETL en SSIS.]</w:t>
-      </w:r>
-    </w:p>
-    <w:p>
-      <w:pPr>
-        <w:pStyle w:val="Heading2"/>
-      </w:pPr>
+        <w:t>[Sección a completar en la Fase 2.]</w:t>
+      </w:r>
+    </w:p>
+    <w:p>
+      <w:pPr>
+        <w:pStyle w:val="Ttulo2"/>
+      </w:pPr>
+      <w:r>
+        <w:t xml:space="preserve">7. </w:t>
+      </w:r>
+      <w:proofErr w:type="spellStart"/>
+      <w:r>
+        <w:t>Dashboard</w:t>
+      </w:r>
+      <w:proofErr w:type="spellEnd"/>
+      <w:r>
+        <w:t xml:space="preserve"> en </w:t>
+      </w:r>
+      <w:proofErr w:type="spellStart"/>
+      <w:r>
+        <w:t>Power</w:t>
+      </w:r>
+      <w:proofErr w:type="spellEnd"/>
+      <w:r>
+        <w:t xml:space="preserve"> BI</w:t>
+      </w:r>
+    </w:p>
+    <w:p>
+      <w:pPr>
+        <w:jc w:val="both"/>
+      </w:pPr>
+      <w:r>
+        <w:t>[Sección a completar en la Fase 2.]</w:t>
+      </w:r>
+    </w:p>
+    <w:p>
+      <w:pPr>
+        <w:pStyle w:val="Ttulo1"/>
+      </w:pPr>
+      <w:r>
+        <w:t>Conclusiones</w:t>
+      </w:r>
+    </w:p>
+    <w:p>
+      <w:pPr>
+        <w:jc w:val="both"/>
+      </w:pPr>
+      <w:r>
+        <w:t xml:space="preserve">El análisis de la base de datos transaccional permitió identificar </w:t>
+      </w:r>
+      <w:r>
+        <w:t>tanto la información útil para la toma de decisiones como sus limitaciones. Los datos presentan una buena integridad, pero no incluyen costos, por lo que los indicadores se enfocaron en las ventas, los descuentos, el desempeño de los empleados y la operaci</w:t>
+      </w:r>
+      <w:r>
+        <w:t>ón de envío.</w:t>
+      </w:r>
+    </w:p>
+    <w:p>
+      <w:pPr>
+        <w:jc w:val="both"/>
+      </w:pPr>
+      <w:r>
+        <w:t>La aplicación de los cuatro pasos de Kimball dio como resultado un modelo estrella compuesto por una tabla de hechos de ventas, con granularidad a nivel de línea de orden, y cinco dimensiones. Este diseño permite calcular los seis KPI definido</w:t>
+      </w:r>
+      <w:r>
+        <w:t>s y analizarlos por período, cliente, producto, empleado y transportista, manteniendo al mismo tiempo la simplicidad necesaria para las etapas siguientes.</w:t>
+      </w:r>
+    </w:p>
+    <w:p>
+      <w:pPr>
+        <w:jc w:val="both"/>
+      </w:pPr>
+      <w:r>
+        <w:t>La implementación en SQL Server incorpora claves sustitutas, claves foráneas y una clave primaria aco</w:t>
+      </w:r>
+      <w:r>
+        <w:t>rde a la granularidad, lo que asegura la consistencia de los datos que se cargarán. Asimismo, los valores de referencia obtenidos durante el análisis permitirán validar que el proceso ETL cargue los datos correctamente.</w:t>
+      </w:r>
+    </w:p>
+    <w:p>
+      <w:pPr>
+        <w:pStyle w:val="Ttulo1"/>
+      </w:pPr>
+      <w:r>
+        <w:t>Bibliografía</w:t>
+      </w:r>
+    </w:p>
+    <w:p>
+      <w:pPr>
+        <w:rPr>
+          <w:lang w:val="en-US"/>
+        </w:rPr>
+      </w:pPr>
+      <w:r>
+        <w:t xml:space="preserve">Kimball, R. y Ross, M. </w:t>
+      </w:r>
+      <w:r>
+        <w:t xml:space="preserve">(2013). </w:t>
+      </w:r>
+      <w:r>
+        <w:rPr>
+          <w:lang w:val="en-US"/>
+        </w:rPr>
+        <w:t>The Data Warehouse Toolkit: The Definitive Guide to Dimensional Modeling (3.a ed.). Wiley.</w:t>
+      </w:r>
+    </w:p>
+    <w:p>
+      <w:pPr>
+        <w:rPr>
+          <w:lang w:val="en-US"/>
+        </w:rPr>
+      </w:pPr>
+      <w:r>
+        <w:rPr>
+          <w:lang w:val="en-US"/>
+        </w:rPr>
+        <w:t>Microsoft. (</w:t>
+      </w:r>
+      <w:proofErr w:type="spellStart"/>
+      <w:r>
+        <w:rPr>
+          <w:lang w:val="en-US"/>
+        </w:rPr>
+        <w:t>s.f.</w:t>
+      </w:r>
+      <w:proofErr w:type="spellEnd"/>
+      <w:r>
+        <w:rPr>
+          <w:lang w:val="en-US"/>
+        </w:rPr>
+        <w:t>). CREATE TABLE (Transact-SQL). Microsoft Learn. https://learn.microsoft.com/es-es/sql/t-sql/statements/create-table-transact-sql</w:t>
+      </w:r>
+    </w:p>
+    <w:p>
+      <w:pPr>
+        <w:rPr>
+          <w:lang w:val="en-US"/>
+        </w:rPr>
+      </w:pPr>
+      <w:r>
+        <w:rPr>
+          <w:lang w:val="en-US"/>
+        </w:rPr>
+        <w:t xml:space="preserve">Microsoft. </w:t>
+      </w:r>
+      <w:r>
+        <w:rPr>
+          <w:lang w:val="en-US"/>
+        </w:rPr>
+        <w:t>(</w:t>
+      </w:r>
+      <w:proofErr w:type="spellStart"/>
+      <w:r>
+        <w:rPr>
+          <w:lang w:val="en-US"/>
+        </w:rPr>
+        <w:t>s.f.</w:t>
+      </w:r>
+      <w:proofErr w:type="spellEnd"/>
+      <w:r>
+        <w:rPr>
+          <w:lang w:val="en-US"/>
+        </w:rPr>
+        <w:t>). SQL Server Integration Services. Microsoft Learn. https://learn.microsoft.com/es-es/sql/integration-services/sql-server-integration-services</w:t>
+      </w:r>
+    </w:p>
+    <w:p>
       <w:r>
         <w:lastRenderedPageBreak/>
-        <w:t>6. Cubos OLAP</w:t>
-      </w:r>
-    </w:p>
-    <w:p>
-      <w:pPr>
-        <w:jc w:val="both"/>
-      </w:pPr>
-      <w:r>
-        <w:t>[Sección a completar en la Fase 2.]</w:t>
-      </w:r>
-    </w:p>
-    <w:p>
-      <w:pPr>
-        <w:pStyle w:val="Heading2"/>
-      </w:pPr>
-      <w:r>
-        <w:t xml:space="preserve">7. </w:t>
+        <w:t xml:space="preserve">Universidad Técnica Federico Santa María. (2026). Caso Semestral Inteligencia de Negocios: Kent </w:t>
       </w:r>
       <w:proofErr w:type="spellStart"/>
       <w:r>
-        <w:t>Dashboard</w:t>
+        <w:t>Foods</w:t>
       </w:r>
       <w:proofErr w:type="spellEnd"/>
       <w:r>
-        <w:t xml:space="preserve"> en </w:t>
-      </w:r>
-      <w:proofErr w:type="spellStart"/>
-      <w:r>
-        <w:t>Power</w:t>
-      </w:r>
-      <w:proofErr w:type="spellEnd"/>
-      <w:r>
-        <w:t xml:space="preserve"> BI</w:t>
-      </w:r>
-    </w:p>
-    <w:p>
-      <w:pPr>
-        <w:jc w:val="both"/>
-      </w:pPr>
-      <w:r>
-        <w:t>[Sección a completar en la Fase 2.]</w:t>
-      </w:r>
-    </w:p>
-    <w:p>
-      <w:pPr>
-        <w:pStyle w:val="Heading1"/>
-      </w:pPr>
-      <w:r>
-        <w:t>Conclusiones</w:t>
-      </w:r>
-    </w:p>
-    <w:p>
-      <w:pPr>
-        <w:jc w:val="both"/>
-      </w:pPr>
-      <w:r>
-        <w:t>El análisis de la base de datos transaccional permitió identificar tanto la información útil para la toma de decisiones como sus limitaciones. Los datos presentan una buena integridad, pero no incluyen costos, por lo que los indicadores se enfocaron en las ventas, los descuentos, el desempeño de los empleados y la operación de envío.</w:t>
-      </w:r>
-    </w:p>
-    <w:p>
-      <w:pPr>
-        <w:jc w:val="both"/>
-      </w:pPr>
-      <w:r>
-        <w:t>La aplicación de los cuatro pasos de Kimball dio como resultado un modelo estrella compuesto por una tabla de hechos de ventas, con granularidad a nivel de línea de orden, y cinco dimensiones. Este diseño permite calcular los seis KPI definidos y analizarlos por período, cliente, producto, empleado y transportista, manteniendo al mismo tiempo la simplicidad necesaria para las etapas siguientes.</w:t>
-      </w:r>
-    </w:p>
-    <w:p>
-      <w:pPr>
-        <w:jc w:val="both"/>
-      </w:pPr>
-      <w:r>
-        <w:t>La implementación en SQL Server incorpora claves sustitutas, claves foráneas y una clave primaria acorde a la granularidad, lo que asegura la consistencia de los datos que se cargarán. Asimismo, los valores de referencia obtenidos durante el análisis permitirán validar que el proceso ETL cargue los datos correctamente.</w:t>
-      </w:r>
-    </w:p>
-    <w:p>
-      <w:pPr>
-        <w:pStyle w:val="Heading1"/>
-      </w:pPr>
-      <w:r>
-        <w:t>Bibliografía</w:t>
-      </w:r>
-    </w:p>
-    <w:p>
-      <w:pPr>
-        <w:rPr>
-          <w:lang w:val="en-US"/>
-        </w:rPr>
-      </w:pPr>
-      <w:r>
-        <w:t xml:space="preserve">Kimball, R. y Ross, M. (2013). </w:t>
-      </w:r>
-      <w:r>
-        <w:rPr>
-          <w:lang w:val="en-US"/>
-        </w:rPr>
-        <w:t>The Data Warehouse Toolkit: The Definitive Guide to Dimensional Modeling (3.a ed.). Wiley.</w:t>
-      </w:r>
-    </w:p>
-    <w:p>
-      <w:pPr>
-        <w:rPr>
-          <w:lang w:val="en-US"/>
-        </w:rPr>
-      </w:pPr>
-      <w:r>
-        <w:rPr>
-          <w:lang w:val="en-US"/>
-        </w:rPr>
-        <w:t>Microsoft. (</w:t>
-      </w:r>
-      <w:proofErr w:type="spellStart"/>
-      <w:r>
-        <w:rPr>
-          <w:lang w:val="en-US"/>
-        </w:rPr>
-        <w:t>s.f.</w:t>
-      </w:r>
-      <w:proofErr w:type="spellEnd"/>
-      <w:r>
-        <w:rPr>
-          <w:lang w:val="en-US"/>
-        </w:rPr>
-        <w:t>). CREATE TABLE (Transact-SQL). Microsoft Learn. https://learn.microsoft.com/es-es/sql/t-sql/statements/create-table-transact-sql</w:t>
-      </w:r>
-    </w:p>
-    <w:p>
-      <w:pPr>
-        <w:rPr>
-          <w:lang w:val="en-US"/>
-        </w:rPr>
-      </w:pPr>
-      <w:r>
-        <w:rPr>
-          <w:lang w:val="en-US"/>
-        </w:rPr>
-        <w:t>Microsoft. (</w:t>
-      </w:r>
-      <w:proofErr w:type="spellStart"/>
-      <w:r>
-        <w:rPr>
-          <w:lang w:val="en-US"/>
-        </w:rPr>
-        <w:t>s.f.</w:t>
-      </w:r>
-      <w:proofErr w:type="spellEnd"/>
-      <w:r>
-        <w:rPr>
-          <w:lang w:val="en-US"/>
-        </w:rPr>
-        <w:t>). SQL Server Integration Services. Microsoft Learn. https://learn.microsoft.com/es-es/sql/integration-services/sql-server-integration-services</w:t>
-      </w:r>
-    </w:p>
-    <w:p>
-      <w:r>
-        <w:t xml:space="preserve">Universidad Técnica Federico Santa María. (2026). Caso Semestral Inteligencia de Negocios: Kent </w:t>
-      </w:r>
-      <w:proofErr w:type="spellStart"/>
-      <w:r>
-        <w:t>Foods</w:t>
-      </w:r>
-      <w:proofErr w:type="spellEnd"/>
-      <w:r>
-        <w:t xml:space="preserve"> [Documento de la asignatura].</w:t>
+        <w:t xml:space="preserve"> [Docu</w:t>
+      </w:r>
+      <w:r>
+        <w:t>mento de la asignatura].</w:t>
       </w:r>
     </w:p>
     <w:sectPr>
@@ -4325,7 +5380,7 @@
 </file>
 
 <file path=word/endnotes.xml><?xml version="1.0" encoding="utf-8"?>
-<w:endnotes xmlns:wpc="http://schemas.microsoft.com/office/word/2010/wordprocessingCanvas" xmlns:cx="http://schemas.microsoft.com/office/drawing/2014/chartex" xmlns:cx1="http://schemas.microsoft.com/office/drawing/2015/9/8/chartex" xmlns:cx2="http://schemas.microsoft.com/office/drawing/2015/10/21/chartex" xmlns:cx3="http://schemas.microsoft.com/office/drawing/2016/5/9/chartex" xmlns:cx4="http://schemas.microsoft.com/office/drawing/2016/5/10/chartex" xmlns:cx5="http://schemas.microsoft.com/office/drawing/2016/5/11/chartex" xmlns:cx6="http://schemas.microsoft.com/office/drawing/2016/5/12/chartex" xmlns:cx7="http://schemas.microsoft.com/office/drawing/2016/5/13/chartex" xmlns:cx8="http://schemas.microsoft.com/office/drawing/2016/5/14/chartex" xmlns:mc="http://schemas.openxmlformats.org/markup-compatibility/2006" xmlns:aink="http://schemas.microsoft.com/office/drawing/2016/ink" xmlns:am3d="http://schemas.microsoft.com/office/drawing/2017/model3d" xmlns:o="urn:schemas-microsoft-com:office:office" xmlns:oel="http://schemas.microsoft.com/office/2019/extlst" xmlns:r="http://schemas.openxmlformats.org/officeDocument/2006/relationships" xmlns:m="http://schemas.openxmlformats.org/officeDocument/2006/math" xmlns:v="urn:schemas-microsoft-com:vml" xmlns:wp14="http://schemas.microsoft.com/office/word/2010/wordprocessingDrawing" xmlns:wp="http://schemas.openxmlformats.org/drawingml/2006/wordprocessingDrawing" xmlns:w10="urn:schemas-microsoft-com:office:word" xmlns:w="http://schemas.openxmlformats.org/wordprocessingml/2006/main" xmlns:w14="http://schemas.microsoft.com/office/word/2010/wordml" xmlns:w15="http://schemas.microsoft.com/office/word/2012/wordml" xmlns:w16cex="http://schemas.microsoft.com/office/word/2018/wordml/cex" xmlns:w16cid="http://schemas.microsoft.com/office/word/2016/wordml/cid" xmlns:w16="http://schemas.microsoft.com/office/word/2018/wordml" xmlns:w16sdtdh="http://schemas.microsoft.com/office/word/2020/wordml/sdtdatahash" xmlns:w16se="http://schemas.microsoft.com/office/word/2015/wordml/symex" xmlns:wpg="http://schemas.microsoft.com/office/word/2010/wordprocessingGroup" xmlns:wpi="http://schemas.microsoft.com/office/word/2010/wordprocessingInk" xmlns:wne="http://schemas.microsoft.com/office/word/2006/wordml" xmlns:wps="http://schemas.microsoft.com/office/word/2010/wordprocessingShape" mc:Ignorable="w14 w15 w16se w16cid w16 w16cex w16sdtdh wp14">
+<w:endnotes xmlns:wpc="http://schemas.microsoft.com/office/word/2010/wordprocessingCanvas" xmlns:cx="http://schemas.microsoft.com/office/drawing/2014/chartex" xmlns:cx1="http://schemas.microsoft.com/office/drawing/2015/9/8/chartex" xmlns:cx2="http://schemas.microsoft.com/office/drawing/2015/10/21/chartex" xmlns:cx3="http://schemas.microsoft.com/office/drawing/2016/5/9/chartex" xmlns:cx4="http://schemas.microsoft.com/office/drawing/2016/5/10/chartex" xmlns:cx5="http://schemas.microsoft.com/office/drawing/2016/5/11/chartex" xmlns:cx6="http://schemas.microsoft.com/office/drawing/2016/5/12/chartex" xmlns:cx7="http://schemas.microsoft.com/office/drawing/2016/5/13/chartex" xmlns:cx8="http://schemas.microsoft.com/office/drawing/2016/5/14/chartex" xmlns:mc="http://schemas.openxmlformats.org/markup-compatibility/2006" xmlns:aink="http://schemas.microsoft.com/office/drawing/2016/ink" xmlns:am3d="http://schemas.microsoft.com/office/drawing/2017/model3d" xmlns:o="urn:schemas-microsoft-com:office:office" xmlns:r="http://schemas.openxmlformats.org/officeDocument/2006/relationships" xmlns:m="http://schemas.openxmlformats.org/officeDocument/2006/math" xmlns:v="urn:schemas-microsoft-com:vml" xmlns:wp14="http://schemas.microsoft.com/office/word/2010/wordprocessingDrawing" xmlns:wp="http://schemas.openxmlformats.org/drawingml/2006/wordprocessingDrawing" xmlns:w10="urn:schemas-microsoft-com:office:word" xmlns:w="http://schemas.openxmlformats.org/wordprocessingml/2006/main" xmlns:w14="http://schemas.microsoft.com/office/word/2010/wordml" xmlns:w15="http://schemas.microsoft.com/office/word/2012/wordml" xmlns:w16cex="http://schemas.microsoft.com/office/word/2018/wordml/cex" xmlns:w16cid="http://schemas.microsoft.com/office/word/2016/wordml/cid" xmlns:w16="http://schemas.microsoft.com/office/word/2018/wordml" xmlns:w16sdtdh="http://schemas.microsoft.com/office/word/2020/wordml/sdtdatahash" xmlns:w16se="http://schemas.microsoft.com/office/word/2015/wordml/symex" xmlns:wpg="http://schemas.microsoft.com/office/word/2010/wordprocessingGroup" xmlns:wpi="http://schemas.microsoft.com/office/word/2010/wordprocessingInk" xmlns:wne="http://schemas.microsoft.com/office/word/2006/wordml" xmlns:wps="http://schemas.microsoft.com/office/word/2010/wordprocessingShape" mc:Ignorable="w14 w15 w16se w16cid w16 w16cex w16sdtdh wp14">
   <w:endnote w:type="separator" w:id="-1">
     <w:p>
       <w:pPr>
@@ -4350,7 +5405,7 @@
 </file>
 
 <file path=word/footer1.xml><?xml version="1.0" encoding="utf-8"?>
-<w:ftr xmlns:wpc="http://schemas.microsoft.com/office/word/2010/wordprocessingCanvas" xmlns:cx="http://schemas.microsoft.com/office/drawing/2014/chartex" xmlns:cx1="http://schemas.microsoft.com/office/drawing/2015/9/8/chartex" xmlns:cx2="http://schemas.microsoft.com/office/drawing/2015/10/21/chartex" xmlns:cx3="http://schemas.microsoft.com/office/drawing/2016/5/9/chartex" xmlns:cx4="http://schemas.microsoft.com/office/drawing/2016/5/10/chartex" xmlns:cx5="http://schemas.microsoft.com/office/drawing/2016/5/11/chartex" xmlns:cx6="http://schemas.microsoft.com/office/drawing/2016/5/12/chartex" xmlns:cx7="http://schemas.microsoft.com/office/drawing/2016/5/13/chartex" xmlns:cx8="http://schemas.microsoft.com/office/drawing/2016/5/14/chartex" xmlns:mc="http://schemas.openxmlformats.org/markup-compatibility/2006" xmlns:aink="http://schemas.microsoft.com/office/drawing/2016/ink" xmlns:am3d="http://schemas.microsoft.com/office/drawing/2017/model3d" xmlns:o="urn:schemas-microsoft-com:office:office" xmlns:oel="http://schemas.microsoft.com/office/2019/extlst" xmlns:r="http://schemas.openxmlformats.org/officeDocument/2006/relationships" xmlns:m="http://schemas.openxmlformats.org/officeDocument/2006/math" xmlns:v="urn:schemas-microsoft-com:vml" xmlns:wp14="http://schemas.microsoft.com/office/word/2010/wordprocessingDrawing" xmlns:wp="http://schemas.openxmlformats.org/drawingml/2006/wordprocessingDrawing" xmlns:w10="urn:schemas-microsoft-com:office:word" xmlns:w="http://schemas.openxmlformats.org/wordprocessingml/2006/main" xmlns:w14="http://schemas.microsoft.com/office/word/2010/wordml" xmlns:w15="http://schemas.microsoft.com/office/word/2012/wordml" xmlns:w16cex="http://schemas.microsoft.com/office/word/2018/wordml/cex" xmlns:w16cid="http://schemas.microsoft.com/office/word/2016/wordml/cid" xmlns:w16="http://schemas.microsoft.com/office/word/2018/wordml" xmlns:w16sdtdh="http://schemas.microsoft.com/office/word/2020/wordml/sdtdatahash" xmlns:w16se="http://schemas.microsoft.com/office/word/2015/wordml/symex" xmlns:wpg="http://schemas.microsoft.com/office/word/2010/wordprocessingGroup" xmlns:wpi="http://schemas.microsoft.com/office/word/2010/wordprocessingInk" xmlns:wne="http://schemas.microsoft.com/office/word/2006/wordml" xmlns:wps="http://schemas.microsoft.com/office/word/2010/wordprocessingShape" mc:Ignorable="w14 w15 w16se w16cid w16 w16cex w16sdtdh wp14">
+<w:ftr xmlns:wpc="http://schemas.microsoft.com/office/word/2010/wordprocessingCanvas" xmlns:cx="http://schemas.microsoft.com/office/drawing/2014/chartex" xmlns:cx1="http://schemas.microsoft.com/office/drawing/2015/9/8/chartex" xmlns:cx2="http://schemas.microsoft.com/office/drawing/2015/10/21/chartex" xmlns:cx3="http://schemas.microsoft.com/office/drawing/2016/5/9/chartex" xmlns:cx4="http://schemas.microsoft.com/office/drawing/2016/5/10/chartex" xmlns:cx5="http://schemas.microsoft.com/office/drawing/2016/5/11/chartex" xmlns:cx6="http://schemas.microsoft.com/office/drawing/2016/5/12/chartex" xmlns:cx7="http://schemas.microsoft.com/office/drawing/2016/5/13/chartex" xmlns:cx8="http://schemas.microsoft.com/office/drawing/2016/5/14/chartex" xmlns:mc="http://schemas.openxmlformats.org/markup-compatibility/2006" xmlns:aink="http://schemas.microsoft.com/office/drawing/2016/ink" xmlns:am3d="http://schemas.microsoft.com/office/drawing/2017/model3d" xmlns:o="urn:schemas-microsoft-com:office:office" xmlns:r="http://schemas.openxmlformats.org/officeDocument/2006/relationships" xmlns:m="http://schemas.openxmlformats.org/officeDocument/2006/math" xmlns:v="urn:schemas-microsoft-com:vml" xmlns:wp14="http://schemas.microsoft.com/office/word/2010/wordprocessingDrawing" xmlns:wp="http://schemas.openxmlformats.org/drawingml/2006/wordprocessingDrawing" xmlns:w10="urn:schemas-microsoft-com:office:word" xmlns:w="http://schemas.openxmlformats.org/wordprocessingml/2006/main" xmlns:w14="http://schemas.microsoft.com/office/word/2010/wordml" xmlns:w15="http://schemas.microsoft.com/office/word/2012/wordml" xmlns:w16cex="http://schemas.microsoft.com/office/word/2018/wordml/cex" xmlns:w16cid="http://schemas.microsoft.com/office/word/2016/wordml/cid" xmlns:w16="http://schemas.microsoft.com/office/word/2018/wordml" xmlns:w16sdtdh="http://schemas.microsoft.com/office/word/2020/wordml/sdtdatahash" xmlns:w16se="http://schemas.microsoft.com/office/word/2015/wordml/symex" xmlns:wpg="http://schemas.microsoft.com/office/word/2010/wordprocessingGroup" xmlns:wpi="http://schemas.microsoft.com/office/word/2010/wordprocessingInk" xmlns:wne="http://schemas.microsoft.com/office/word/2006/wordml" xmlns:wps="http://schemas.microsoft.com/office/word/2010/wordprocessingShape" mc:Ignorable="w14 w15 w16se w16cid w16 w16cex w16sdtdh wp14">
   <w:p>
     <w:pPr>
       <w:jc w:val="right"/>
@@ -4378,13 +5433,13 @@
 </file>
 
 <file path=word/footer2.xml><?xml version="1.0" encoding="utf-8"?>
-<w:ftr xmlns:wpc="http://schemas.microsoft.com/office/word/2010/wordprocessingCanvas" xmlns:cx="http://schemas.microsoft.com/office/drawing/2014/chartex" xmlns:cx1="http://schemas.microsoft.com/office/drawing/2015/9/8/chartex" xmlns:cx2="http://schemas.microsoft.com/office/drawing/2015/10/21/chartex" xmlns:cx3="http://schemas.microsoft.com/office/drawing/2016/5/9/chartex" xmlns:cx4="http://schemas.microsoft.com/office/drawing/2016/5/10/chartex" xmlns:cx5="http://schemas.microsoft.com/office/drawing/2016/5/11/chartex" xmlns:cx6="http://schemas.microsoft.com/office/drawing/2016/5/12/chartex" xmlns:cx7="http://schemas.microsoft.com/office/drawing/2016/5/13/chartex" xmlns:cx8="http://schemas.microsoft.com/office/drawing/2016/5/14/chartex" xmlns:mc="http://schemas.openxmlformats.org/markup-compatibility/2006" xmlns:aink="http://schemas.microsoft.com/office/drawing/2016/ink" xmlns:am3d="http://schemas.microsoft.com/office/drawing/2017/model3d" xmlns:o="urn:schemas-microsoft-com:office:office" xmlns:oel="http://schemas.microsoft.com/office/2019/extlst" xmlns:r="http://schemas.openxmlformats.org/officeDocument/2006/relationships" xmlns:m="http://schemas.openxmlformats.org/officeDocument/2006/math" xmlns:v="urn:schemas-microsoft-com:vml" xmlns:wp14="http://schemas.microsoft.com/office/word/2010/wordprocessingDrawing" xmlns:wp="http://schemas.openxmlformats.org/drawingml/2006/wordprocessingDrawing" xmlns:w10="urn:schemas-microsoft-com:office:word" xmlns:w="http://schemas.openxmlformats.org/wordprocessingml/2006/main" xmlns:w14="http://schemas.microsoft.com/office/word/2010/wordml" xmlns:w15="http://schemas.microsoft.com/office/word/2012/wordml" xmlns:w16cex="http://schemas.microsoft.com/office/word/2018/wordml/cex" xmlns:w16cid="http://schemas.microsoft.com/office/word/2016/wordml/cid" xmlns:w16="http://schemas.microsoft.com/office/word/2018/wordml" xmlns:w16sdtdh="http://schemas.microsoft.com/office/word/2020/wordml/sdtdatahash" xmlns:w16se="http://schemas.microsoft.com/office/word/2015/wordml/symex" xmlns:wpg="http://schemas.microsoft.com/office/word/2010/wordprocessingGroup" xmlns:wpi="http://schemas.microsoft.com/office/word/2010/wordprocessingInk" xmlns:wne="http://schemas.microsoft.com/office/word/2006/wordml" xmlns:wps="http://schemas.microsoft.com/office/word/2010/wordprocessingShape" mc:Ignorable="w14 w15 w16se w16cid w16 w16cex w16sdtdh wp14">
+<w:ftr xmlns:wpc="http://schemas.microsoft.com/office/word/2010/wordprocessingCanvas" xmlns:cx="http://schemas.microsoft.com/office/drawing/2014/chartex" xmlns:cx1="http://schemas.microsoft.com/office/drawing/2015/9/8/chartex" xmlns:cx2="http://schemas.microsoft.com/office/drawing/2015/10/21/chartex" xmlns:cx3="http://schemas.microsoft.com/office/drawing/2016/5/9/chartex" xmlns:cx4="http://schemas.microsoft.com/office/drawing/2016/5/10/chartex" xmlns:cx5="http://schemas.microsoft.com/office/drawing/2016/5/11/chartex" xmlns:cx6="http://schemas.microsoft.com/office/drawing/2016/5/12/chartex" xmlns:cx7="http://schemas.microsoft.com/office/drawing/2016/5/13/chartex" xmlns:cx8="http://schemas.microsoft.com/office/drawing/2016/5/14/chartex" xmlns:mc="http://schemas.openxmlformats.org/markup-compatibility/2006" xmlns:aink="http://schemas.microsoft.com/office/drawing/2016/ink" xmlns:am3d="http://schemas.microsoft.com/office/drawing/2017/model3d" xmlns:o="urn:schemas-microsoft-com:office:office" xmlns:r="http://schemas.openxmlformats.org/officeDocument/2006/relationships" xmlns:m="http://schemas.openxmlformats.org/officeDocument/2006/math" xmlns:v="urn:schemas-microsoft-com:vml" xmlns:wp14="http://schemas.microsoft.com/office/word/2010/wordprocessingDrawing" xmlns:wp="http://schemas.openxmlformats.org/drawingml/2006/wordprocessingDrawing" xmlns:w10="urn:schemas-microsoft-com:office:word" xmlns:w="http://schemas.openxmlformats.org/wordprocessingml/2006/main" xmlns:w14="http://schemas.microsoft.com/office/word/2010/wordml" xmlns:w15="http://schemas.microsoft.com/office/word/2012/wordml" xmlns:w16cex="http://schemas.microsoft.com/office/word/2018/wordml/cex" xmlns:w16cid="http://schemas.microsoft.com/office/word/2016/wordml/cid" xmlns:w16="http://schemas.microsoft.com/office/word/2018/wordml" xmlns:w16sdtdh="http://schemas.microsoft.com/office/word/2020/wordml/sdtdatahash" xmlns:w16se="http://schemas.microsoft.com/office/word/2015/wordml/symex" xmlns:wpg="http://schemas.microsoft.com/office/word/2010/wordprocessingGroup" xmlns:wpi="http://schemas.microsoft.com/office/word/2010/wordprocessingInk" xmlns:wne="http://schemas.microsoft.com/office/word/2006/wordml" xmlns:wps="http://schemas.microsoft.com/office/word/2010/wordprocessingShape" mc:Ignorable="w14 w15 w16se w16cid w16 w16cex w16sdtdh wp14">
   <w:p/>
 </w:ftr>
 </file>
 
 <file path=word/footnotes.xml><?xml version="1.0" encoding="utf-8"?>
-<w:footnotes xmlns:wpc="http://schemas.microsoft.com/office/word/2010/wordprocessingCanvas" xmlns:cx="http://schemas.microsoft.com/office/drawing/2014/chartex" xmlns:cx1="http://schemas.microsoft.com/office/drawing/2015/9/8/chartex" xmlns:cx2="http://schemas.microsoft.com/office/drawing/2015/10/21/chartex" xmlns:cx3="http://schemas.microsoft.com/office/drawing/2016/5/9/chartex" xmlns:cx4="http://schemas.microsoft.com/office/drawing/2016/5/10/chartex" xmlns:cx5="http://schemas.microsoft.com/office/drawing/2016/5/11/chartex" xmlns:cx6="http://schemas.microsoft.com/office/drawing/2016/5/12/chartex" xmlns:cx7="http://schemas.microsoft.com/office/drawing/2016/5/13/chartex" xmlns:cx8="http://schemas.microsoft.com/office/drawing/2016/5/14/chartex" xmlns:mc="http://schemas.openxmlformats.org/markup-compatibility/2006" xmlns:aink="http://schemas.microsoft.com/office/drawing/2016/ink" xmlns:am3d="http://schemas.microsoft.com/office/drawing/2017/model3d" xmlns:o="urn:schemas-microsoft-com:office:office" xmlns:oel="http://schemas.microsoft.com/office/2019/extlst" xmlns:r="http://schemas.openxmlformats.org/officeDocument/2006/relationships" xmlns:m="http://schemas.openxmlformats.org/officeDocument/2006/math" xmlns:v="urn:schemas-microsoft-com:vml" xmlns:wp14="http://schemas.microsoft.com/office/word/2010/wordprocessingDrawing" xmlns:wp="http://schemas.openxmlformats.org/drawingml/2006/wordprocessingDrawing" xmlns:w10="urn:schemas-microsoft-com:office:word" xmlns:w="http://schemas.openxmlformats.org/wordprocessingml/2006/main" xmlns:w14="http://schemas.microsoft.com/office/word/2010/wordml" xmlns:w15="http://schemas.microsoft.com/office/word/2012/wordml" xmlns:w16cex="http://schemas.microsoft.com/office/word/2018/wordml/cex" xmlns:w16cid="http://schemas.microsoft.com/office/word/2016/wordml/cid" xmlns:w16="http://schemas.microsoft.com/office/word/2018/wordml" xmlns:w16sdtdh="http://schemas.microsoft.com/office/word/2020/wordml/sdtdatahash" xmlns:w16se="http://schemas.microsoft.com/office/word/2015/wordml/symex" xmlns:wpg="http://schemas.microsoft.com/office/word/2010/wordprocessingGroup" xmlns:wpi="http://schemas.microsoft.com/office/word/2010/wordprocessingInk" xmlns:wne="http://schemas.microsoft.com/office/word/2006/wordml" xmlns:wps="http://schemas.microsoft.com/office/word/2010/wordprocessingShape" mc:Ignorable="w14 w15 w16se w16cid w16 w16cex w16sdtdh wp14">
+<w:footnotes xmlns:wpc="http://schemas.microsoft.com/office/word/2010/wordprocessingCanvas" xmlns:cx="http://schemas.microsoft.com/office/drawing/2014/chartex" xmlns:cx1="http://schemas.microsoft.com/office/drawing/2015/9/8/chartex" xmlns:cx2="http://schemas.microsoft.com/office/drawing/2015/10/21/chartex" xmlns:cx3="http://schemas.microsoft.com/office/drawing/2016/5/9/chartex" xmlns:cx4="http://schemas.microsoft.com/office/drawing/2016/5/10/chartex" xmlns:cx5="http://schemas.microsoft.com/office/drawing/2016/5/11/chartex" xmlns:cx6="http://schemas.microsoft.com/office/drawing/2016/5/12/chartex" xmlns:cx7="http://schemas.microsoft.com/office/drawing/2016/5/13/chartex" xmlns:cx8="http://schemas.microsoft.com/office/drawing/2016/5/14/chartex" xmlns:mc="http://schemas.openxmlformats.org/markup-compatibility/2006" xmlns:aink="http://schemas.microsoft.com/office/drawing/2016/ink" xmlns:am3d="http://schemas.microsoft.com/office/drawing/2017/model3d" xmlns:o="urn:schemas-microsoft-com:office:office" xmlns:r="http://schemas.openxmlformats.org/officeDocument/2006/relationships" xmlns:m="http://schemas.openxmlformats.org/officeDocument/2006/math" xmlns:v="urn:schemas-microsoft-com:vml" xmlns:wp14="http://schemas.microsoft.com/office/word/2010/wordprocessingDrawing" xmlns:wp="http://schemas.openxmlformats.org/drawingml/2006/wordprocessingDrawing" xmlns:w10="urn:schemas-microsoft-com:office:word" xmlns:w="http://schemas.openxmlformats.org/wordprocessingml/2006/main" xmlns:w14="http://schemas.microsoft.com/office/word/2010/wordml" xmlns:w15="http://schemas.microsoft.com/office/word/2012/wordml" xmlns:w16cex="http://schemas.microsoft.com/office/word/2018/wordml/cex" xmlns:w16cid="http://schemas.microsoft.com/office/word/2016/wordml/cid" xmlns:w16="http://schemas.microsoft.com/office/word/2018/wordml" xmlns:w16sdtdh="http://schemas.microsoft.com/office/word/2020/wordml/sdtdatahash" xmlns:w16se="http://schemas.microsoft.com/office/word/2015/wordml/symex" xmlns:wpg="http://schemas.microsoft.com/office/word/2010/wordprocessingGroup" xmlns:wpi="http://schemas.microsoft.com/office/word/2010/wordprocessingInk" xmlns:wne="http://schemas.microsoft.com/office/word/2006/wordml" xmlns:wps="http://schemas.microsoft.com/office/word/2010/wordprocessingShape" mc:Ignorable="w14 w15 w16se w16cid w16 w16cex w16sdtdh wp14">
   <w:footnote w:type="separator" w:id="-1">
     <w:p>
       <w:pPr>
@@ -4409,7 +5464,7 @@
 </file>
 
 <file path=word/numbering.xml><?xml version="1.0" encoding="utf-8"?>
-<w:numbering xmlns:wpc="http://schemas.microsoft.com/office/word/2010/wordprocessingCanvas" xmlns:cx="http://schemas.microsoft.com/office/drawing/2014/chartex" xmlns:cx1="http://schemas.microsoft.com/office/drawing/2015/9/8/chartex" xmlns:cx2="http://schemas.microsoft.com/office/drawing/2015/10/21/chartex" xmlns:cx3="http://schemas.microsoft.com/office/drawing/2016/5/9/chartex" xmlns:cx4="http://schemas.microsoft.com/office/drawing/2016/5/10/chartex" xmlns:cx5="http://schemas.microsoft.com/office/drawing/2016/5/11/chartex" xmlns:cx6="http://schemas.microsoft.com/office/drawing/2016/5/12/chartex" xmlns:cx7="http://schemas.microsoft.com/office/drawing/2016/5/13/chartex" xmlns:cx8="http://schemas.microsoft.com/office/drawing/2016/5/14/chartex" xmlns:mc="http://schemas.openxmlformats.org/markup-compatibility/2006" xmlns:aink="http://schemas.microsoft.com/office/drawing/2016/ink" xmlns:am3d="http://schemas.microsoft.com/office/drawing/2017/model3d" xmlns:o="urn:schemas-microsoft-com:office:office" xmlns:oel="http://schemas.microsoft.com/office/2019/extlst" xmlns:r="http://schemas.openxmlformats.org/officeDocument/2006/relationships" xmlns:m="http://schemas.openxmlformats.org/officeDocument/2006/math" xmlns:v="urn:schemas-microsoft-com:vml" xmlns:wp14="http://schemas.microsoft.com/office/word/2010/wordprocessingDrawing" xmlns:wp="http://schemas.openxmlformats.org/drawingml/2006/wordprocessingDrawing" xmlns:w10="urn:schemas-microsoft-com:office:word" xmlns:w="http://schemas.openxmlformats.org/wordprocessingml/2006/main" xmlns:w14="http://schemas.microsoft.com/office/word/2010/wordml" xmlns:w15="http://schemas.microsoft.com/office/word/2012/wordml" xmlns:w16cex="http://schemas.microsoft.com/office/word/2018/wordml/cex" xmlns:w16cid="http://schemas.microsoft.com/office/word/2016/wordml/cid" xmlns:w16="http://schemas.microsoft.com/office/word/2018/wordml" xmlns:w16sdtdh="http://schemas.microsoft.com/office/word/2020/wordml/sdtdatahash" xmlns:w16se="http://schemas.microsoft.com/office/word/2015/wordml/symex" xmlns:wpg="http://schemas.microsoft.com/office/word/2010/wordprocessingGroup" xmlns:wpi="http://schemas.microsoft.com/office/word/2010/wordprocessingInk" xmlns:wne="http://schemas.microsoft.com/office/word/2006/wordml" xmlns:wps="http://schemas.microsoft.com/office/word/2010/wordprocessingShape" mc:Ignorable="w14 w15 w16se w16cid w16 w16cex w16sdtdh wp14">
+<w:numbering xmlns:wpc="http://schemas.microsoft.com/office/word/2010/wordprocessingCanvas" xmlns:cx="http://schemas.microsoft.com/office/drawing/2014/chartex" xmlns:cx1="http://schemas.microsoft.com/office/drawing/2015/9/8/chartex" xmlns:cx2="http://schemas.microsoft.com/office/drawing/2015/10/21/chartex" xmlns:cx3="http://schemas.microsoft.com/office/drawing/2016/5/9/chartex" xmlns:cx4="http://schemas.microsoft.com/office/drawing/2016/5/10/chartex" xmlns:cx5="http://schemas.microsoft.com/office/drawing/2016/5/11/chartex" xmlns:cx6="http://schemas.microsoft.com/office/drawing/2016/5/12/chartex" xmlns:cx7="http://schemas.microsoft.com/office/drawing/2016/5/13/chartex" xmlns:cx8="http://schemas.microsoft.com/office/drawing/2016/5/14/chartex" xmlns:mc="http://schemas.openxmlformats.org/markup-compatibility/2006" xmlns:aink="http://schemas.microsoft.com/office/drawing/2016/ink" xmlns:am3d="http://schemas.microsoft.com/office/drawing/2017/model3d" xmlns:o="urn:schemas-microsoft-com:office:office" xmlns:r="http://schemas.openxmlformats.org/officeDocument/2006/relationships" xmlns:m="http://schemas.openxmlformats.org/officeDocument/2006/math" xmlns:v="urn:schemas-microsoft-com:vml" xmlns:wp14="http://schemas.microsoft.com/office/word/2010/wordprocessingDrawing" xmlns:wp="http://schemas.openxmlformats.org/drawingml/2006/wordprocessingDrawing" xmlns:w10="urn:schemas-microsoft-com:office:word" xmlns:w="http://schemas.openxmlformats.org/wordprocessingml/2006/main" xmlns:w14="http://schemas.microsoft.com/office/word/2010/wordml" xmlns:w15="http://schemas.microsoft.com/office/word/2012/wordml" xmlns:w16cex="http://schemas.microsoft.com/office/word/2018/wordml/cex" xmlns:w16cid="http://schemas.microsoft.com/office/word/2016/wordml/cid" xmlns:w16="http://schemas.microsoft.com/office/word/2018/wordml" xmlns:w16sdtdh="http://schemas.microsoft.com/office/word/2020/wordml/sdtdatahash" xmlns:w16se="http://schemas.microsoft.com/office/word/2015/wordml/symex" xmlns:wpg="http://schemas.microsoft.com/office/word/2010/wordprocessingGroup" xmlns:wpi="http://schemas.microsoft.com/office/word/2010/wordprocessingInk" xmlns:wne="http://schemas.microsoft.com/office/word/2006/wordml" xmlns:wps="http://schemas.microsoft.com/office/word/2010/wordprocessingShape" mc:Ignorable="w14 w15 w16se w16cid w16 w16cex w16sdtdh wp14">
   <w:abstractNum w:abstractNumId="0" w15:restartNumberingAfterBreak="0">
     <w:nsid w:val="23146672"/>
     <w:multiLevelType w:val="hybridMultilevel"/>
@@ -4497,6 +5552,155 @@
     </w:lvl>
   </w:abstractNum>
   <w:abstractNum w:abstractNumId="1" w15:restartNumberingAfterBreak="0">
+    <w:nsid w:val="49B151A6"/>
+    <w:multiLevelType w:val="multilevel"/>
+    <w:tmpl w:val="08EECBB6"/>
+    <w:lvl w:ilvl="0">
+      <w:start w:val="1"/>
+      <w:numFmt w:val="bullet"/>
+      <w:lvlText w:val=""/>
+      <w:lvlJc w:val="left"/>
+      <w:pPr>
+        <w:tabs>
+          <w:tab w:val="num" w:pos="720"/>
+        </w:tabs>
+        <w:ind w:left="720" w:hanging="360"/>
+      </w:pPr>
+      <w:rPr>
+        <w:rFonts w:ascii="Symbol" w:hAnsi="Symbol" w:hint="default"/>
+        <w:sz w:val="20"/>
+      </w:rPr>
+    </w:lvl>
+    <w:lvl w:ilvl="1" w:tentative="1">
+      <w:start w:val="1"/>
+      <w:numFmt w:val="bullet"/>
+      <w:lvlText w:val="o"/>
+      <w:lvlJc w:val="left"/>
+      <w:pPr>
+        <w:tabs>
+          <w:tab w:val="num" w:pos="1440"/>
+        </w:tabs>
+        <w:ind w:left="1440" w:hanging="360"/>
+      </w:pPr>
+      <w:rPr>
+        <w:rFonts w:ascii="Courier New" w:hAnsi="Courier New" w:hint="default"/>
+        <w:sz w:val="20"/>
+      </w:rPr>
+    </w:lvl>
+    <w:lvl w:ilvl="2" w:tentative="1">
+      <w:start w:val="1"/>
+      <w:numFmt w:val="bullet"/>
+      <w:lvlText w:val=""/>
+      <w:lvlJc w:val="left"/>
+      <w:pPr>
+        <w:tabs>
+          <w:tab w:val="num" w:pos="2160"/>
+        </w:tabs>
+        <w:ind w:left="2160" w:hanging="360"/>
+      </w:pPr>
+      <w:rPr>
+        <w:rFonts w:ascii="Wingdings" w:hAnsi="Wingdings" w:hint="default"/>
+        <w:sz w:val="20"/>
+      </w:rPr>
+    </w:lvl>
+    <w:lvl w:ilvl="3" w:tentative="1">
+      <w:start w:val="1"/>
+      <w:numFmt w:val="bullet"/>
+      <w:lvlText w:val=""/>
+      <w:lvlJc w:val="left"/>
+      <w:pPr>
+        <w:tabs>
+          <w:tab w:val="num" w:pos="2880"/>
+        </w:tabs>
+        <w:ind w:left="2880" w:hanging="360"/>
+      </w:pPr>
+      <w:rPr>
+        <w:rFonts w:ascii="Wingdings" w:hAnsi="Wingdings" w:hint="default"/>
+        <w:sz w:val="20"/>
+      </w:rPr>
+    </w:lvl>
+    <w:lvl w:ilvl="4" w:tentative="1">
+      <w:start w:val="1"/>
+      <w:numFmt w:val="bullet"/>
+      <w:lvlText w:val=""/>
+      <w:lvlJc w:val="left"/>
+      <w:pPr>
+        <w:tabs>
+          <w:tab w:val="num" w:pos="3600"/>
+        </w:tabs>
+        <w:ind w:left="3600" w:hanging="360"/>
+      </w:pPr>
+      <w:rPr>
+        <w:rFonts w:ascii="Wingdings" w:hAnsi="Wingdings" w:hint="default"/>
+        <w:sz w:val="20"/>
+      </w:rPr>
+    </w:lvl>
+    <w:lvl w:ilvl="5" w:tentative="1">
+      <w:start w:val="1"/>
+      <w:numFmt w:val="bullet"/>
+      <w:lvlText w:val=""/>
+      <w:lvlJc w:val="left"/>
+      <w:pPr>
+        <w:tabs>
+          <w:tab w:val="num" w:pos="4320"/>
+        </w:tabs>
+        <w:ind w:left="4320" w:hanging="360"/>
+      </w:pPr>
+      <w:rPr>
+        <w:rFonts w:ascii="Wingdings" w:hAnsi="Wingdings" w:hint="default"/>
+        <w:sz w:val="20"/>
+      </w:rPr>
+    </w:lvl>
+    <w:lvl w:ilvl="6" w:tentative="1">
+      <w:start w:val="1"/>
+      <w:numFmt w:val="bullet"/>
+      <w:lvlText w:val=""/>
+      <w:lvlJc w:val="left"/>
+      <w:pPr>
+        <w:tabs>
+          <w:tab w:val="num" w:pos="5040"/>
+        </w:tabs>
+        <w:ind w:left="5040" w:hanging="360"/>
+      </w:pPr>
+      <w:rPr>
+        <w:rFonts w:ascii="Wingdings" w:hAnsi="Wingdings" w:hint="default"/>
+        <w:sz w:val="20"/>
+      </w:rPr>
+    </w:lvl>
+    <w:lvl w:ilvl="7" w:tentative="1">
+      <w:start w:val="1"/>
+      <w:numFmt w:val="bullet"/>
+      <w:lvlText w:val=""/>
+      <w:lvlJc w:val="left"/>
+      <w:pPr>
+        <w:tabs>
+          <w:tab w:val="num" w:pos="5760"/>
+        </w:tabs>
+        <w:ind w:left="5760" w:hanging="360"/>
+      </w:pPr>
+      <w:rPr>
+        <w:rFonts w:ascii="Wingdings" w:hAnsi="Wingdings" w:hint="default"/>
+        <w:sz w:val="20"/>
+      </w:rPr>
+    </w:lvl>
+    <w:lvl w:ilvl="8" w:tentative="1">
+      <w:start w:val="1"/>
+      <w:numFmt w:val="bullet"/>
+      <w:lvlText w:val=""/>
+      <w:lvlJc w:val="left"/>
+      <w:pPr>
+        <w:tabs>
+          <w:tab w:val="num" w:pos="6480"/>
+        </w:tabs>
+        <w:ind w:left="6480" w:hanging="360"/>
+      </w:pPr>
+      <w:rPr>
+        <w:rFonts w:ascii="Wingdings" w:hAnsi="Wingdings" w:hint="default"/>
+        <w:sz w:val="20"/>
+      </w:rPr>
+    </w:lvl>
+  </w:abstractNum>
+  <w:abstractNum w:abstractNumId="2" w15:restartNumberingAfterBreak="0">
     <w:nsid w:val="611358B0"/>
     <w:multiLevelType w:val="hybridMultilevel"/>
     <w:tmpl w:val="3F888F84"/>
@@ -4550,17 +5754,404 @@
       <w:lvlJc w:val="left"/>
     </w:lvl>
   </w:abstractNum>
-  <w:num w:numId="1" w16cid:durableId="54401285">
+  <w:abstractNum w:abstractNumId="3" w15:restartNumberingAfterBreak="0">
+    <w:nsid w:val="64E60E1A"/>
+    <w:multiLevelType w:val="multilevel"/>
+    <w:tmpl w:val="5582EB86"/>
+    <w:lvl w:ilvl="0">
+      <w:start w:val="1"/>
+      <w:numFmt w:val="bullet"/>
+      <w:lvlText w:val=""/>
+      <w:lvlJc w:val="left"/>
+      <w:pPr>
+        <w:tabs>
+          <w:tab w:val="num" w:pos="720"/>
+        </w:tabs>
+        <w:ind w:left="720" w:hanging="360"/>
+      </w:pPr>
+      <w:rPr>
+        <w:rFonts w:ascii="Symbol" w:hAnsi="Symbol" w:hint="default"/>
+        <w:sz w:val="20"/>
+      </w:rPr>
+    </w:lvl>
+    <w:lvl w:ilvl="1" w:tentative="1">
+      <w:start w:val="1"/>
+      <w:numFmt w:val="bullet"/>
+      <w:lvlText w:val="o"/>
+      <w:lvlJc w:val="left"/>
+      <w:pPr>
+        <w:tabs>
+          <w:tab w:val="num" w:pos="1440"/>
+        </w:tabs>
+        <w:ind w:left="1440" w:hanging="360"/>
+      </w:pPr>
+      <w:rPr>
+        <w:rFonts w:ascii="Courier New" w:hAnsi="Courier New" w:hint="default"/>
+        <w:sz w:val="20"/>
+      </w:rPr>
+    </w:lvl>
+    <w:lvl w:ilvl="2" w:tentative="1">
+      <w:start w:val="1"/>
+      <w:numFmt w:val="bullet"/>
+      <w:lvlText w:val=""/>
+      <w:lvlJc w:val="left"/>
+      <w:pPr>
+        <w:tabs>
+          <w:tab w:val="num" w:pos="2160"/>
+        </w:tabs>
+        <w:ind w:left="2160" w:hanging="360"/>
+      </w:pPr>
+      <w:rPr>
+        <w:rFonts w:ascii="Wingdings" w:hAnsi="Wingdings" w:hint="default"/>
+        <w:sz w:val="20"/>
+      </w:rPr>
+    </w:lvl>
+    <w:lvl w:ilvl="3" w:tentative="1">
+      <w:start w:val="1"/>
+      <w:numFmt w:val="bullet"/>
+      <w:lvlText w:val=""/>
+      <w:lvlJc w:val="left"/>
+      <w:pPr>
+        <w:tabs>
+          <w:tab w:val="num" w:pos="2880"/>
+        </w:tabs>
+        <w:ind w:left="2880" w:hanging="360"/>
+      </w:pPr>
+      <w:rPr>
+        <w:rFonts w:ascii="Wingdings" w:hAnsi="Wingdings" w:hint="default"/>
+        <w:sz w:val="20"/>
+      </w:rPr>
+    </w:lvl>
+    <w:lvl w:ilvl="4" w:tentative="1">
+      <w:start w:val="1"/>
+      <w:numFmt w:val="bullet"/>
+      <w:lvlText w:val=""/>
+      <w:lvlJc w:val="left"/>
+      <w:pPr>
+        <w:tabs>
+          <w:tab w:val="num" w:pos="3600"/>
+        </w:tabs>
+        <w:ind w:left="3600" w:hanging="360"/>
+      </w:pPr>
+      <w:rPr>
+        <w:rFonts w:ascii="Wingdings" w:hAnsi="Wingdings" w:hint="default"/>
+        <w:sz w:val="20"/>
+      </w:rPr>
+    </w:lvl>
+    <w:lvl w:ilvl="5" w:tentative="1">
+      <w:start w:val="1"/>
+      <w:numFmt w:val="bullet"/>
+      <w:lvlText w:val=""/>
+      <w:lvlJc w:val="left"/>
+      <w:pPr>
+        <w:tabs>
+          <w:tab w:val="num" w:pos="4320"/>
+        </w:tabs>
+        <w:ind w:left="4320" w:hanging="360"/>
+      </w:pPr>
+      <w:rPr>
+        <w:rFonts w:ascii="Wingdings" w:hAnsi="Wingdings" w:hint="default"/>
+        <w:sz w:val="20"/>
+      </w:rPr>
+    </w:lvl>
+    <w:lvl w:ilvl="6" w:tentative="1">
+      <w:start w:val="1"/>
+      <w:numFmt w:val="bullet"/>
+      <w:lvlText w:val=""/>
+      <w:lvlJc w:val="left"/>
+      <w:pPr>
+        <w:tabs>
+          <w:tab w:val="num" w:pos="5040"/>
+        </w:tabs>
+        <w:ind w:left="5040" w:hanging="360"/>
+      </w:pPr>
+      <w:rPr>
+        <w:rFonts w:ascii="Wingdings" w:hAnsi="Wingdings" w:hint="default"/>
+        <w:sz w:val="20"/>
+      </w:rPr>
+    </w:lvl>
+    <w:lvl w:ilvl="7" w:tentative="1">
+      <w:start w:val="1"/>
+      <w:numFmt w:val="bullet"/>
+      <w:lvlText w:val=""/>
+      <w:lvlJc w:val="left"/>
+      <w:pPr>
+        <w:tabs>
+          <w:tab w:val="num" w:pos="5760"/>
+        </w:tabs>
+        <w:ind w:left="5760" w:hanging="360"/>
+      </w:pPr>
+      <w:rPr>
+        <w:rFonts w:ascii="Wingdings" w:hAnsi="Wingdings" w:hint="default"/>
+        <w:sz w:val="20"/>
+      </w:rPr>
+    </w:lvl>
+    <w:lvl w:ilvl="8" w:tentative="1">
+      <w:start w:val="1"/>
+      <w:numFmt w:val="bullet"/>
+      <w:lvlText w:val=""/>
+      <w:lvlJc w:val="left"/>
+      <w:pPr>
+        <w:tabs>
+          <w:tab w:val="num" w:pos="6480"/>
+        </w:tabs>
+        <w:ind w:left="6480" w:hanging="360"/>
+      </w:pPr>
+      <w:rPr>
+        <w:rFonts w:ascii="Wingdings" w:hAnsi="Wingdings" w:hint="default"/>
+        <w:sz w:val="20"/>
+      </w:rPr>
+    </w:lvl>
+  </w:abstractNum>
+  <w:abstractNum w:abstractNumId="4" w15:restartNumberingAfterBreak="0">
+    <w:nsid w:val="73403DBD"/>
+    <w:multiLevelType w:val="multilevel"/>
+    <w:tmpl w:val="8918FC60"/>
+    <w:lvl w:ilvl="0">
+      <w:start w:val="1"/>
+      <w:numFmt w:val="decimal"/>
+      <w:lvlText w:val="%1."/>
+      <w:lvlJc w:val="left"/>
+      <w:pPr>
+        <w:tabs>
+          <w:tab w:val="num" w:pos="720"/>
+        </w:tabs>
+        <w:ind w:left="720" w:hanging="360"/>
+      </w:pPr>
+    </w:lvl>
+    <w:lvl w:ilvl="1" w:tentative="1">
+      <w:start w:val="1"/>
+      <w:numFmt w:val="decimal"/>
+      <w:lvlText w:val="%2."/>
+      <w:lvlJc w:val="left"/>
+      <w:pPr>
+        <w:tabs>
+          <w:tab w:val="num" w:pos="1440"/>
+        </w:tabs>
+        <w:ind w:left="1440" w:hanging="360"/>
+      </w:pPr>
+    </w:lvl>
+    <w:lvl w:ilvl="2" w:tentative="1">
+      <w:start w:val="1"/>
+      <w:numFmt w:val="decimal"/>
+      <w:lvlText w:val="%3."/>
+      <w:lvlJc w:val="left"/>
+      <w:pPr>
+        <w:tabs>
+          <w:tab w:val="num" w:pos="2160"/>
+        </w:tabs>
+        <w:ind w:left="2160" w:hanging="360"/>
+      </w:pPr>
+    </w:lvl>
+    <w:lvl w:ilvl="3" w:tentative="1">
+      <w:start w:val="1"/>
+      <w:numFmt w:val="decimal"/>
+      <w:lvlText w:val="%4."/>
+      <w:lvlJc w:val="left"/>
+      <w:pPr>
+        <w:tabs>
+          <w:tab w:val="num" w:pos="2880"/>
+        </w:tabs>
+        <w:ind w:left="2880" w:hanging="360"/>
+      </w:pPr>
+    </w:lvl>
+    <w:lvl w:ilvl="4" w:tentative="1">
+      <w:start w:val="1"/>
+      <w:numFmt w:val="decimal"/>
+      <w:lvlText w:val="%5."/>
+      <w:lvlJc w:val="left"/>
+      <w:pPr>
+        <w:tabs>
+          <w:tab w:val="num" w:pos="3600"/>
+        </w:tabs>
+        <w:ind w:left="3600" w:hanging="360"/>
+      </w:pPr>
+    </w:lvl>
+    <w:lvl w:ilvl="5" w:tentative="1">
+      <w:start w:val="1"/>
+      <w:numFmt w:val="decimal"/>
+      <w:lvlText w:val="%6."/>
+      <w:lvlJc w:val="left"/>
+      <w:pPr>
+        <w:tabs>
+          <w:tab w:val="num" w:pos="4320"/>
+        </w:tabs>
+        <w:ind w:left="4320" w:hanging="360"/>
+      </w:pPr>
+    </w:lvl>
+    <w:lvl w:ilvl="6" w:tentative="1">
+      <w:start w:val="1"/>
+      <w:numFmt w:val="decimal"/>
+      <w:lvlText w:val="%7."/>
+      <w:lvlJc w:val="left"/>
+      <w:pPr>
+        <w:tabs>
+          <w:tab w:val="num" w:pos="5040"/>
+        </w:tabs>
+        <w:ind w:left="5040" w:hanging="360"/>
+      </w:pPr>
+    </w:lvl>
+    <w:lvl w:ilvl="7" w:tentative="1">
+      <w:start w:val="1"/>
+      <w:numFmt w:val="decimal"/>
+      <w:lvlText w:val="%8."/>
+      <w:lvlJc w:val="left"/>
+      <w:pPr>
+        <w:tabs>
+          <w:tab w:val="num" w:pos="5760"/>
+        </w:tabs>
+        <w:ind w:left="5760" w:hanging="360"/>
+      </w:pPr>
+    </w:lvl>
+    <w:lvl w:ilvl="8" w:tentative="1">
+      <w:start w:val="1"/>
+      <w:numFmt w:val="decimal"/>
+      <w:lvlText w:val="%9."/>
+      <w:lvlJc w:val="left"/>
+      <w:pPr>
+        <w:tabs>
+          <w:tab w:val="num" w:pos="6480"/>
+        </w:tabs>
+        <w:ind w:left="6480" w:hanging="360"/>
+      </w:pPr>
+    </w:lvl>
+  </w:abstractNum>
+  <w:abstractNum w:abstractNumId="5" w15:restartNumberingAfterBreak="0">
+    <w:nsid w:val="7A1838E7"/>
+    <w:multiLevelType w:val="multilevel"/>
+    <w:tmpl w:val="508EC9F6"/>
+    <w:lvl w:ilvl="0">
+      <w:start w:val="1"/>
+      <w:numFmt w:val="decimal"/>
+      <w:lvlText w:val="%1."/>
+      <w:lvlJc w:val="left"/>
+      <w:pPr>
+        <w:tabs>
+          <w:tab w:val="num" w:pos="720"/>
+        </w:tabs>
+        <w:ind w:left="720" w:hanging="360"/>
+      </w:pPr>
+    </w:lvl>
+    <w:lvl w:ilvl="1" w:tentative="1">
+      <w:start w:val="1"/>
+      <w:numFmt w:val="decimal"/>
+      <w:lvlText w:val="%2."/>
+      <w:lvlJc w:val="left"/>
+      <w:pPr>
+        <w:tabs>
+          <w:tab w:val="num" w:pos="1440"/>
+        </w:tabs>
+        <w:ind w:left="1440" w:hanging="360"/>
+      </w:pPr>
+    </w:lvl>
+    <w:lvl w:ilvl="2" w:tentative="1">
+      <w:start w:val="1"/>
+      <w:numFmt w:val="decimal"/>
+      <w:lvlText w:val="%3."/>
+      <w:lvlJc w:val="left"/>
+      <w:pPr>
+        <w:tabs>
+          <w:tab w:val="num" w:pos="2160"/>
+        </w:tabs>
+        <w:ind w:left="2160" w:hanging="360"/>
+      </w:pPr>
+    </w:lvl>
+    <w:lvl w:ilvl="3" w:tentative="1">
+      <w:start w:val="1"/>
+      <w:numFmt w:val="decimal"/>
+      <w:lvlText w:val="%4."/>
+      <w:lvlJc w:val="left"/>
+      <w:pPr>
+        <w:tabs>
+          <w:tab w:val="num" w:pos="2880"/>
+        </w:tabs>
+        <w:ind w:left="2880" w:hanging="360"/>
+      </w:pPr>
+    </w:lvl>
+    <w:lvl w:ilvl="4" w:tentative="1">
+      <w:start w:val="1"/>
+      <w:numFmt w:val="decimal"/>
+      <w:lvlText w:val="%5."/>
+      <w:lvlJc w:val="left"/>
+      <w:pPr>
+        <w:tabs>
+          <w:tab w:val="num" w:pos="3600"/>
+        </w:tabs>
+        <w:ind w:left="3600" w:hanging="360"/>
+      </w:pPr>
+    </w:lvl>
+    <w:lvl w:ilvl="5" w:tentative="1">
+      <w:start w:val="1"/>
+      <w:numFmt w:val="decimal"/>
+      <w:lvlText w:val="%6."/>
+      <w:lvlJc w:val="left"/>
+      <w:pPr>
+        <w:tabs>
+          <w:tab w:val="num" w:pos="4320"/>
+        </w:tabs>
+        <w:ind w:left="4320" w:hanging="360"/>
+      </w:pPr>
+    </w:lvl>
+    <w:lvl w:ilvl="6" w:tentative="1">
+      <w:start w:val="1"/>
+      <w:numFmt w:val="decimal"/>
+      <w:lvlText w:val="%7."/>
+      <w:lvlJc w:val="left"/>
+      <w:pPr>
+        <w:tabs>
+          <w:tab w:val="num" w:pos="5040"/>
+        </w:tabs>
+        <w:ind w:left="5040" w:hanging="360"/>
+      </w:pPr>
+    </w:lvl>
+    <w:lvl w:ilvl="7" w:tentative="1">
+      <w:start w:val="1"/>
+      <w:numFmt w:val="decimal"/>
+      <w:lvlText w:val="%8."/>
+      <w:lvlJc w:val="left"/>
+      <w:pPr>
+        <w:tabs>
+          <w:tab w:val="num" w:pos="5760"/>
+        </w:tabs>
+        <w:ind w:left="5760" w:hanging="360"/>
+      </w:pPr>
+    </w:lvl>
+    <w:lvl w:ilvl="8" w:tentative="1">
+      <w:start w:val="1"/>
+      <w:numFmt w:val="decimal"/>
+      <w:lvlText w:val="%9."/>
+      <w:lvlJc w:val="left"/>
+      <w:pPr>
+        <w:tabs>
+          <w:tab w:val="num" w:pos="6480"/>
+        </w:tabs>
+        <w:ind w:left="6480" w:hanging="360"/>
+      </w:pPr>
+    </w:lvl>
+  </w:abstractNum>
+  <w:num w:numId="1">
     <w:abstractNumId w:val="0"/>
     <w:lvlOverride w:ilvl="0">
       <w:startOverride w:val="1"/>
     </w:lvlOverride>
   </w:num>
-  <w:num w:numId="2" w16cid:durableId="1454598523">
-    <w:abstractNumId w:val="1"/>
+  <w:num w:numId="2">
+    <w:abstractNumId w:val="2"/>
     <w:lvlOverride w:ilvl="0">
       <w:startOverride w:val="1"/>
     </w:lvlOverride>
+  </w:num>
+  <w:num w:numId="3">
+    <w:abstractNumId w:val="5"/>
+  </w:num>
+  <w:num w:numId="4">
+    <w:abstractNumId w:val="3"/>
+  </w:num>
+  <w:num w:numId="5">
+    <w:abstractNumId w:val="4"/>
+  </w:num>
+  <w:num w:numId="6">
+    <w:abstractNumId w:val="1"/>
   </w:num>
 </w:numbering>
 </file>
@@ -4963,7 +6554,7 @@
       <w:spacing w:after="120" w:line="360" w:lineRule="auto"/>
     </w:pPr>
   </w:style>
-  <w:style w:type="paragraph" w:styleId="Heading1">
+  <w:style w:type="paragraph" w:styleId="Ttulo1">
     <w:name w:val="heading 1"/>
     <w:basedOn w:val="Normal"/>
     <w:next w:val="Normal"/>
@@ -4978,7 +6569,7 @@
       <w:color w:val="000000"/>
     </w:rPr>
   </w:style>
-  <w:style w:type="paragraph" w:styleId="Heading2">
+  <w:style w:type="paragraph" w:styleId="Ttulo2">
     <w:name w:val="heading 2"/>
     <w:basedOn w:val="Normal"/>
     <w:next w:val="Normal"/>
@@ -4994,7 +6585,7 @@
       <w:color w:val="000000"/>
     </w:rPr>
   </w:style>
-  <w:style w:type="paragraph" w:styleId="Heading3">
+  <w:style w:type="paragraph" w:styleId="Ttulo3">
     <w:name w:val="heading 3"/>
     <w:basedOn w:val="Normal"/>
     <w:next w:val="Normal"/>
@@ -5011,7 +6602,7 @@
       <w:szCs w:val="24"/>
     </w:rPr>
   </w:style>
-  <w:style w:type="paragraph" w:styleId="Heading4">
+  <w:style w:type="paragraph" w:styleId="Ttulo4">
     <w:name w:val="heading 4"/>
     <w:basedOn w:val="Normal"/>
     <w:next w:val="Normal"/>
@@ -5028,7 +6619,7 @@
       <w:color w:val="2E74B5"/>
     </w:rPr>
   </w:style>
-  <w:style w:type="paragraph" w:styleId="Heading5">
+  <w:style w:type="paragraph" w:styleId="Ttulo5">
     <w:name w:val="heading 5"/>
     <w:basedOn w:val="Normal"/>
     <w:next w:val="Normal"/>
@@ -5043,7 +6634,7 @@
       <w:color w:val="2E74B5"/>
     </w:rPr>
   </w:style>
-  <w:style w:type="paragraph" w:styleId="Heading6">
+  <w:style w:type="paragraph" w:styleId="Ttulo6">
     <w:name w:val="heading 6"/>
     <w:basedOn w:val="Normal"/>
     <w:next w:val="Normal"/>
@@ -5058,13 +6649,12 @@
       <w:color w:val="1F4D78"/>
     </w:rPr>
   </w:style>
-  <w:style w:type="character" w:default="1" w:styleId="DefaultParagraphFont">
+  <w:style w:type="character" w:default="1" w:styleId="Fuentedeprrafopredeter">
     <w:name w:val="Default Paragraph Font"/>
     <w:uiPriority w:val="1"/>
-    <w:semiHidden/>
     <w:unhideWhenUsed/>
   </w:style>
-  <w:style w:type="table" w:default="1" w:styleId="TableNormal">
+  <w:style w:type="table" w:default="1" w:styleId="Tablanormal">
     <w:name w:val="Normal Table"/>
     <w:uiPriority w:val="99"/>
     <w:semiHidden/>
@@ -5079,13 +6669,13 @@
       </w:tblCellMar>
     </w:tblPr>
   </w:style>
-  <w:style w:type="numbering" w:default="1" w:styleId="NoList">
+  <w:style w:type="numbering" w:default="1" w:styleId="Sinlista">
     <w:name w:val="No List"/>
     <w:uiPriority w:val="99"/>
     <w:semiHidden/>
     <w:unhideWhenUsed/>
   </w:style>
-  <w:style w:type="paragraph" w:styleId="Title">
+  <w:style w:type="paragraph" w:styleId="Ttulo">
     <w:name w:val="Title"/>
     <w:basedOn w:val="Normal"/>
     <w:next w:val="Normal"/>
@@ -5106,12 +6696,12 @@
       <w:bCs/>
     </w:rPr>
   </w:style>
-  <w:style w:type="paragraph" w:styleId="ListParagraph">
+  <w:style w:type="paragraph" w:styleId="Prrafodelista">
     <w:name w:val="List Paragraph"/>
     <w:basedOn w:val="Normal"/>
     <w:qFormat/>
   </w:style>
-  <w:style w:type="character" w:styleId="Hyperlink">
+  <w:style w:type="character" w:styleId="Hipervnculo">
     <w:name w:val="Hyperlink"/>
     <w:uiPriority w:val="99"/>
     <w:unhideWhenUsed/>
@@ -5120,7 +6710,7 @@
       <w:u w:val="single"/>
     </w:rPr>
   </w:style>
-  <w:style w:type="character" w:styleId="FootnoteReference">
+  <w:style w:type="character" w:styleId="Refdenotaalpie">
     <w:name w:val="footnote reference"/>
     <w:uiPriority w:val="99"/>
     <w:semiHidden/>
@@ -5129,10 +6719,10 @@
       <w:vertAlign w:val="superscript"/>
     </w:rPr>
   </w:style>
-  <w:style w:type="paragraph" w:styleId="FootnoteText">
+  <w:style w:type="paragraph" w:styleId="Textonotapie">
     <w:name w:val="footnote text"/>
     <w:basedOn w:val="Normal"/>
-    <w:link w:val="FootnoteTextChar"/>
+    <w:link w:val="TextonotapieCar"/>
     <w:uiPriority w:val="99"/>
     <w:semiHidden/>
     <w:unhideWhenUsed/>
@@ -5144,9 +6734,9 @@
       <w:szCs w:val="20"/>
     </w:rPr>
   </w:style>
-  <w:style w:type="character" w:customStyle="1" w:styleId="FootnoteTextChar">
-    <w:name w:val="Footnote Text Char"/>
-    <w:link w:val="FootnoteText"/>
+  <w:style w:type="character" w:customStyle="1" w:styleId="TextonotapieCar">
+    <w:name w:val="Texto nota pie Car"/>
+    <w:link w:val="Textonotapie"/>
     <w:uiPriority w:val="99"/>
     <w:semiHidden/>
     <w:unhideWhenUsed/>
@@ -5155,7 +6745,7 @@
       <w:szCs w:val="20"/>
     </w:rPr>
   </w:style>
-  <w:style w:type="character" w:styleId="EndnoteReference">
+  <w:style w:type="character" w:styleId="Refdenotaalfinal">
     <w:name w:val="endnote reference"/>
     <w:uiPriority w:val="99"/>
     <w:semiHidden/>
@@ -5164,10 +6754,10 @@
       <w:vertAlign w:val="superscript"/>
     </w:rPr>
   </w:style>
-  <w:style w:type="paragraph" w:styleId="EndnoteText">
+  <w:style w:type="paragraph" w:styleId="Textonotaalfinal">
     <w:name w:val="endnote text"/>
     <w:basedOn w:val="Normal"/>
-    <w:link w:val="EndnoteTextChar"/>
+    <w:link w:val="TextonotaalfinalCar"/>
     <w:uiPriority w:val="99"/>
     <w:semiHidden/>
     <w:unhideWhenUsed/>
@@ -5179,9 +6769,9 @@
       <w:szCs w:val="20"/>
     </w:rPr>
   </w:style>
-  <w:style w:type="character" w:customStyle="1" w:styleId="EndnoteTextChar">
-    <w:name w:val="Endnote Text Char"/>
-    <w:link w:val="EndnoteText"/>
+  <w:style w:type="character" w:customStyle="1" w:styleId="TextonotaalfinalCar">
+    <w:name w:val="Texto nota al final Car"/>
+    <w:link w:val="Textonotaalfinal"/>
     <w:uiPriority w:val="99"/>
     <w:semiHidden/>
     <w:unhideWhenUsed/>

</xml_diff>